<commit_message>
10/21 F2: Lon moved after all three A clips with a full expert block (producer, 10/14); outline A beats reordered
Co-Authored-By: Claude Opus 5.5 <noreply@anthropic.com>
Claude-Session: https://claude.ai/code/session_01VmRatYBunsoj9i1F4m2msf
</commit_message>
<xml_diff>
--- a/runs/W_10212026/F2 Wed 10_21 -- Your TV Is Watching What You Watch.docx
+++ b/runs/W_10212026/F2 Wed 10_21 -- Your TV Is Watching What You Watch.docx
@@ -868,7 +868,322 @@
           <w:color w:val="000000"/>
           <w:sz w:val="36"/>
         </w:rPr>
-        <w:t>-TECH EXPERT LON SEIDMAN IS HERE. HE REVIEWS THIS STUFF FOR A LIVING.</w:t>
+        <w:t xml:space="preserve">-IT'S CALLED </w:t>
+      </w:r>
+      <w:r>
+        <w:rPr>
+          <w:rFonts w:ascii="Arial" w:hAnsi="Arial" w:cs="Arial" w:eastAsia="Arial"/>
+          <w:b/>
+          <w:color w:val="000000"/>
+          <w:sz w:val="36"/>
+        </w:rPr>
+        <w:t>ACR</w:t>
+      </w:r>
+      <w:r>
+        <w:rPr>
+          <w:rFonts w:ascii="Arial" w:hAnsi="Arial" w:cs="Arial" w:eastAsia="Arial"/>
+          <w:b w:val="0"/>
+          <w:color w:val="000000"/>
+          <w:sz w:val="36"/>
+        </w:rPr>
+        <w:t>. THE TV GRABS WHAT'S ON YOUR SCREEN… AND MATCHES IT TO A DATABASE.</w:t>
+      </w:r>
+    </w:p>
+    <w:p>
+      <w:pPr>
+        <w:spacing w:lineRule="auto" w:line="276" w:before="0" w:after="0"/>
+      </w:pPr>
+      <w:r>
+        <w:rPr>
+          <w:rFonts w:ascii="Arial" w:hAnsi="Arial" w:cs="Arial" w:eastAsia="Arial"/>
+          <w:b w:val="0"/>
+          <w:color w:val="000000"/>
+          <w:sz w:val="36"/>
+        </w:rPr>
+      </w:r>
+    </w:p>
+    <w:p>
+      <w:pPr>
+        <w:spacing w:lineRule="auto" w:line="276" w:before="0" w:after="0"/>
+      </w:pPr>
+      <w:r>
+        <w:rPr>
+          <w:rFonts w:ascii="Arial" w:hAnsi="Arial" w:cs="Arial" w:eastAsia="Arial"/>
+          <w:b w:val="0"/>
+          <w:color w:val="000000"/>
+          <w:sz w:val="36"/>
+        </w:rPr>
+        <w:t>-SO THEY KNOW EXACTLY WHAT YOU'RE WATCHING. SO WHERE DOES ALL THAT GO?</w:t>
+      </w:r>
+    </w:p>
+    <w:p>
+      <w:pPr>
+        <w:spacing w:lineRule="auto" w:line="276" w:before="0" w:after="0"/>
+      </w:pPr>
+      <w:r>
+        <w:rPr>
+          <w:rFonts w:ascii="Arial" w:hAnsi="Arial" w:cs="Arial" w:eastAsia="Arial"/>
+          <w:b w:val="0"/>
+          <w:color w:val="000000"/>
+          <w:sz w:val="36"/>
+        </w:rPr>
+      </w:r>
+    </w:p>
+    <w:p>
+      <w:pPr>
+        <w:spacing w:lineRule="auto" w:line="276" w:before="0" w:after="0"/>
+      </w:pPr>
+      <w:r>
+        <w:rPr>
+          <w:rFonts w:ascii="Arial" w:hAnsi="Arial" w:cs="Arial" w:eastAsia="Arial"/>
+          <w:b/>
+          <w:color w:val="000000"/>
+          <w:sz w:val="46"/>
+        </w:rPr>
+        <w:t>AND WHO'S BUYING IT? THE TV COMPANY'S OWN FINE PRINT SAYS IT!!</w:t>
+      </w:r>
+    </w:p>
+    <w:p>
+      <w:pPr>
+        <w:spacing w:lineRule="auto" w:line="276" w:before="0" w:after="0"/>
+      </w:pPr>
+      <w:r>
+        <w:rPr>
+          <w:rFonts w:ascii="Arial" w:hAnsi="Arial" w:cs="Arial" w:eastAsia="Arial"/>
+          <w:b w:val="0"/>
+          <w:color w:val="000000"/>
+          <w:sz w:val="36"/>
+        </w:rPr>
+      </w:r>
+    </w:p>
+    <w:p>
+      <w:pPr>
+        <w:spacing w:lineRule="auto" w:line="276" w:before="0" w:after="0"/>
+      </w:pPr>
+      <w:r>
+        <w:rPr>
+          <w:rFonts w:ascii="Arial" w:hAnsi="Arial" w:cs="Arial" w:eastAsia="Arial"/>
+          <w:b w:val="0"/>
+          <w:color w:val="000000"/>
+          <w:sz w:val="36"/>
+        </w:rPr>
+        <w:t xml:space="preserve">-WALMART OWNS </w:t>
+      </w:r>
+      <w:r>
+        <w:rPr>
+          <w:rFonts w:ascii="Arial" w:hAnsi="Arial" w:cs="Arial" w:eastAsia="Arial"/>
+          <w:b/>
+          <w:color w:val="000000"/>
+          <w:sz w:val="36"/>
+        </w:rPr>
+        <w:t>VIZIO</w:t>
+      </w:r>
+      <w:r>
+        <w:rPr>
+          <w:rFonts w:ascii="Arial" w:hAnsi="Arial" w:cs="Arial" w:eastAsia="Arial"/>
+          <w:b w:val="0"/>
+          <w:color w:val="000000"/>
+          <w:sz w:val="36"/>
+        </w:rPr>
+        <w:t xml:space="preserve"> NOW. IT BOUGHT THE TV MAKER FOR ABOUT </w:t>
+      </w:r>
+      <w:r>
+        <w:rPr>
+          <w:rFonts w:ascii="Arial" w:hAnsi="Arial" w:cs="Arial" w:eastAsia="Arial"/>
+          <w:b/>
+          <w:color w:val="000000"/>
+          <w:sz w:val="36"/>
+        </w:rPr>
+        <w:t>2.3 BILLION DOLLARS</w:t>
+      </w:r>
+      <w:r>
+        <w:rPr>
+          <w:rFonts w:ascii="Arial" w:hAnsi="Arial" w:cs="Arial" w:eastAsia="Arial"/>
+          <w:b w:val="0"/>
+          <w:color w:val="000000"/>
+          <w:sz w:val="36"/>
+        </w:rPr>
+        <w:t>.</w:t>
+      </w:r>
+    </w:p>
+    <w:p>
+      <w:pPr>
+        <w:spacing w:lineRule="auto" w:line="276" w:before="0" w:after="0"/>
+      </w:pPr>
+      <w:r>
+        <w:rPr>
+          <w:rFonts w:ascii="Arial" w:hAnsi="Arial" w:cs="Arial" w:eastAsia="Arial"/>
+          <w:b w:val="0"/>
+          <w:color w:val="000000"/>
+          <w:sz w:val="36"/>
+        </w:rPr>
+      </w:r>
+    </w:p>
+    <w:p>
+      <w:pPr>
+        <w:spacing w:lineRule="auto" w:line="276" w:before="0" w:after="0"/>
+      </w:pPr>
+      <w:r>
+        <w:rPr>
+          <w:rFonts w:ascii="Arial" w:hAnsi="Arial" w:cs="Arial" w:eastAsia="Arial"/>
+          <w:b w:val="0"/>
+          <w:color w:val="000000"/>
+          <w:sz w:val="36"/>
+        </w:rPr>
+        <w:t>-AND VIZIO'S OWN PRIVACY POLICY SPELLS OUT WHAT IT COLLECTS.</w:t>
+      </w:r>
+    </w:p>
+    <w:p>
+      <w:pPr>
+        <w:spacing w:lineRule="auto" w:line="276" w:before="0" w:after="0"/>
+      </w:pPr>
+      <w:r>
+        <w:rPr>
+          <w:rFonts w:ascii="Arial" w:hAnsi="Arial" w:cs="Arial" w:eastAsia="Arial"/>
+          <w:b w:val="0"/>
+          <w:color w:val="000000"/>
+          <w:sz w:val="36"/>
+        </w:rPr>
+      </w:r>
+    </w:p>
+    <w:p>
+      <w:pPr>
+        <w:spacing w:lineRule="auto" w:line="276" w:before="0" w:after="0"/>
+      </w:pPr>
+      <w:r>
+        <w:rPr>
+          <w:rFonts w:ascii="Arial" w:hAnsi="Arial" w:cs="Arial" w:eastAsia="Arial"/>
+          <w:b w:val="0"/>
+          <w:color w:val="000000"/>
+          <w:sz w:val="36"/>
+        </w:rPr>
+        <w:t>-SHOWS. COMMERCIALS. VIDEO GAMES. EVEN WHAT YOU PLUG INTO THE TV.</w:t>
+      </w:r>
+    </w:p>
+    <w:p>
+      <w:pPr>
+        <w:spacing w:lineRule="auto" w:line="276" w:before="0" w:after="0"/>
+      </w:pPr>
+      <w:r>
+        <w:rPr>
+          <w:rFonts w:ascii="Arial" w:hAnsi="Arial" w:cs="Arial" w:eastAsia="Arial"/>
+          <w:b w:val="0"/>
+          <w:color w:val="000000"/>
+          <w:sz w:val="36"/>
+        </w:rPr>
+      </w:r>
+    </w:p>
+    <w:p>
+      <w:pPr>
+        <w:spacing w:lineRule="auto" w:line="276" w:before="0" w:after="0"/>
+      </w:pPr>
+      <w:r>
+        <w:rPr>
+          <w:rFonts w:ascii="Arial" w:hAnsi="Arial" w:cs="Arial" w:eastAsia="Arial"/>
+          <w:b w:val="0"/>
+          <w:color w:val="000000"/>
+          <w:sz w:val="36"/>
+        </w:rPr>
+        <w:t xml:space="preserve">-IT CALLS ALL OF THAT </w:t>
+      </w:r>
+      <w:r>
+        <w:rPr>
+          <w:rFonts w:ascii="Arial" w:hAnsi="Arial" w:cs="Arial" w:eastAsia="Arial"/>
+          <w:b/>
+          <w:color w:val="000000"/>
+          <w:sz w:val="36"/>
+        </w:rPr>
+        <w:t>VIEWING DATA</w:t>
+      </w:r>
+      <w:r>
+        <w:rPr>
+          <w:rFonts w:ascii="Arial" w:hAnsi="Arial" w:cs="Arial" w:eastAsia="Arial"/>
+          <w:b w:val="0"/>
+          <w:color w:val="000000"/>
+          <w:sz w:val="36"/>
+        </w:rPr>
+        <w:t>.</w:t>
+      </w:r>
+    </w:p>
+    <w:p>
+      <w:pPr>
+        <w:spacing w:lineRule="auto" w:line="276" w:before="0" w:after="0"/>
+      </w:pPr>
+      <w:r>
+        <w:rPr>
+          <w:rFonts w:ascii="Arial" w:hAnsi="Arial" w:cs="Arial" w:eastAsia="Arial"/>
+          <w:b w:val="0"/>
+          <w:color w:val="000000"/>
+          <w:sz w:val="36"/>
+        </w:rPr>
+      </w:r>
+    </w:p>
+    <w:p>
+      <w:pPr>
+        <w:spacing w:lineRule="auto" w:line="276" w:before="0" w:after="0"/>
+      </w:pPr>
+      <w:r>
+        <w:rPr>
+          <w:rFonts w:ascii="Arial" w:hAnsi="Arial" w:cs="Arial" w:eastAsia="Arial"/>
+          <w:b w:val="0"/>
+          <w:color w:val="000000"/>
+          <w:sz w:val="36"/>
+        </w:rPr>
+        <w:t>-THIS CREATOR SAT DOWN AND READ THE WHOLE POLICY.</w:t>
+      </w:r>
+    </w:p>
+    <w:p>
+      <w:pPr>
+        <w:spacing w:lineRule="auto" w:line="276" w:before="0" w:after="0"/>
+      </w:pPr>
+      <w:r>
+        <w:rPr>
+          <w:rFonts w:ascii="Arial" w:hAnsi="Arial" w:cs="Arial" w:eastAsia="Arial"/>
+          <w:b w:val="0"/>
+          <w:color w:val="000000"/>
+          <w:sz w:val="36"/>
+        </w:rPr>
+      </w:r>
+    </w:p>
+    <w:p>
+      <w:pPr>
+        <w:spacing w:lineRule="auto" w:line="276" w:before="0" w:after="0"/>
+      </w:pPr>
+      <w:r>
+        <w:rPr>
+          <w:rFonts w:ascii="Arial" w:hAnsi="Arial" w:cs="Arial" w:eastAsia="Arial"/>
+          <w:b w:val="0"/>
+          <w:color w:val="000000"/>
+          <w:sz w:val="36"/>
+        </w:rPr>
+        <w:t>-SO WHO GETS YOUR VIEWING DATA… AND WHAT DO THEY ATTACH TO IT???</w:t>
+      </w:r>
+    </w:p>
+    <w:p>
+      <w:pPr>
+        <w:spacing w:lineRule="auto" w:line="276" w:before="0" w:after="0"/>
+      </w:pPr>
+      <w:r>
+        <w:rPr>
+          <w:rFonts w:ascii="Arial" w:hAnsi="Arial" w:cs="Arial" w:eastAsia="Arial"/>
+          <w:b w:val="0"/>
+          <w:color w:val="000000"/>
+          <w:sz w:val="36"/>
+        </w:rPr>
+      </w:r>
+    </w:p>
+    <w:p>
+      <w:pPr>
+        <w:spacing w:lineRule="auto" w:line="276" w:before="0" w:after="0"/>
+      </w:pPr>
+      <w:r>
+        <w:rPr>
+          <w:rFonts w:ascii="Arial" w:hAnsi="Arial" w:cs="Arial" w:eastAsia="Arial"/>
+          <w:b w:val="0"/>
+          <w:color w:val="000000"/>
+          <w:sz w:val="36"/>
+        </w:rPr>
+        <w:t>-LISTEN TO THIS.</w:t>
       </w:r>
     </w:p>
     <w:p>
@@ -895,442 +1210,7 @@
           <w:color w:val="FF0000"/>
           <w:sz w:val="36"/>
         </w:rPr>
-        <w:t>(((BRING IN LON)))</w:t>
-      </w:r>
-    </w:p>
-    <w:p>
-      <w:pPr>
-        <w:spacing w:lineRule="auto" w:line="276" w:before="0" w:after="0"/>
-      </w:pPr>
-      <w:r>
-        <w:rPr>
-          <w:rFonts w:ascii="Arial" w:hAnsi="Arial" w:cs="Arial" w:eastAsia="Arial"/>
-          <w:b w:val="0"/>
-          <w:color w:val="000000"/>
-          <w:sz w:val="36"/>
-        </w:rPr>
-      </w:r>
-    </w:p>
-    <w:p>
-      <w:pPr>
-        <w:spacing w:lineRule="auto" w:line="276" w:before="0" w:after="0"/>
-      </w:pPr>
-      <w:r>
-        <w:rPr>
-          <w:rFonts w:ascii="Arial" w:hAnsi="Arial" w:cs="Arial" w:eastAsia="Arial"/>
-          <w:b w:val="0"/>
-          <w:color w:val="000000"/>
-          <w:sz w:val="36"/>
-        </w:rPr>
-        <w:t>-LON, WHAT IS MY TV ACTUALLY DOING?</w:t>
-      </w:r>
-    </w:p>
-    <w:p>
-      <w:pPr>
-        <w:spacing w:lineRule="auto" w:line="276" w:before="0" w:after="0"/>
-      </w:pPr>
-      <w:r>
-        <w:rPr>
-          <w:rFonts w:ascii="Arial" w:hAnsi="Arial" w:cs="Arial" w:eastAsia="Arial"/>
-          <w:b w:val="0"/>
-          <w:color w:val="000000"/>
-          <w:sz w:val="36"/>
-        </w:rPr>
-      </w:r>
-    </w:p>
-    <w:p>
-      <w:pPr>
-        <w:spacing w:lineRule="auto" w:line="276" w:before="0" w:after="0"/>
-      </w:pPr>
-      <w:commentRangeStart w:id="0"/>
-      <w:r>
-        <w:rPr>
-          <w:rFonts w:ascii="Arial" w:hAnsi="Arial" w:cs="Arial" w:eastAsia="Arial"/>
-          <w:b w:val="0"/>
-          <w:color w:val="000000"/>
-          <w:sz w:val="36"/>
-        </w:rPr>
-        <w:t xml:space="preserve">LON: IT'S CALLED </w:t>
-      </w:r>
-      <w:r>
-        <w:rPr>
-          <w:rFonts w:ascii="Arial" w:hAnsi="Arial" w:cs="Arial" w:eastAsia="Arial"/>
-          <w:b/>
-          <w:color w:val="000000"/>
-          <w:sz w:val="36"/>
-        </w:rPr>
-        <w:t>ACR</w:t>
-      </w:r>
-      <w:r>
-        <w:rPr>
-          <w:rFonts w:ascii="Arial" w:hAnsi="Arial" w:cs="Arial" w:eastAsia="Arial"/>
-          <w:b w:val="0"/>
-          <w:color w:val="000000"/>
-          <w:sz w:val="36"/>
-        </w:rPr>
-        <w:t>. THE TV TAKES SNAPSHOTS OF WHAT'S ON THE SCREEN AND MATCHES THEM TO A DATABASE.</w:t>
-      </w:r>
-      <w:commentRangeEnd w:id="0"/>
-      <w:r>
-        <w:rPr>
-          <w:rStyle w:val="CommentReference"/>
-        </w:rPr>
-        <w:commentReference w:id="0"/>
-      </w:r>
-    </w:p>
-    <w:p>
-      <w:pPr>
-        <w:spacing w:lineRule="auto" w:line="276" w:before="0" w:after="0"/>
-      </w:pPr>
-      <w:r>
-        <w:rPr>
-          <w:rFonts w:ascii="Arial" w:hAnsi="Arial" w:cs="Arial" w:eastAsia="Arial"/>
-          <w:b w:val="0"/>
-          <w:color w:val="000000"/>
-          <w:sz w:val="36"/>
-        </w:rPr>
-      </w:r>
-    </w:p>
-    <w:p>
-      <w:pPr>
-        <w:spacing w:lineRule="auto" w:line="276" w:before="0" w:after="0"/>
-      </w:pPr>
-      <w:r>
-        <w:rPr>
-          <w:rFonts w:ascii="Arial" w:hAnsi="Arial" w:cs="Arial" w:eastAsia="Arial"/>
-          <w:b w:val="0"/>
-          <w:color w:val="000000"/>
-          <w:sz w:val="36"/>
-        </w:rPr>
-        <w:t xml:space="preserve">LON: IT'S ON BY DEFAULT. ONE STUDY CAUGHT LG SETS DOING IT ABOUT </w:t>
-      </w:r>
-      <w:r>
-        <w:rPr>
-          <w:rFonts w:ascii="Arial" w:hAnsi="Arial" w:cs="Arial" w:eastAsia="Arial"/>
-          <w:b/>
-          <w:color w:val="000000"/>
-          <w:sz w:val="36"/>
-        </w:rPr>
-        <w:t>EVERY 15 SECONDS</w:t>
-      </w:r>
-      <w:r>
-        <w:rPr>
-          <w:rFonts w:ascii="Arial" w:hAnsi="Arial" w:cs="Arial" w:eastAsia="Arial"/>
-          <w:b w:val="0"/>
-          <w:color w:val="000000"/>
-          <w:sz w:val="36"/>
-        </w:rPr>
-        <w:t>.</w:t>
-      </w:r>
-    </w:p>
-    <w:p>
-      <w:pPr>
-        <w:spacing w:lineRule="auto" w:line="276" w:before="0" w:after="0"/>
-      </w:pPr>
-      <w:r>
-        <w:rPr>
-          <w:rFonts w:ascii="Arial" w:hAnsi="Arial" w:cs="Arial" w:eastAsia="Arial"/>
-          <w:b w:val="0"/>
-          <w:color w:val="000000"/>
-          <w:sz w:val="36"/>
-        </w:rPr>
-      </w:r>
-    </w:p>
-    <w:p>
-      <w:pPr>
-        <w:spacing w:lineRule="auto" w:line="276" w:before="0" w:after="0"/>
-      </w:pPr>
-      <w:r>
-        <w:rPr>
-          <w:rFonts w:ascii="Arial" w:hAnsi="Arial" w:cs="Arial" w:eastAsia="Arial"/>
-          <w:b w:val="0"/>
-          <w:color w:val="000000"/>
-          <w:sz w:val="36"/>
-        </w:rPr>
-        <w:t>-SO WHERE DOES ALL THAT GO?</w:t>
-      </w:r>
-    </w:p>
-    <w:p>
-      <w:pPr>
-        <w:spacing w:lineRule="auto" w:line="276" w:before="0" w:after="0"/>
-      </w:pPr>
-      <w:r>
-        <w:rPr>
-          <w:rFonts w:ascii="Arial" w:hAnsi="Arial" w:cs="Arial" w:eastAsia="Arial"/>
-          <w:b w:val="0"/>
-          <w:color w:val="000000"/>
-          <w:sz w:val="36"/>
-        </w:rPr>
-      </w:r>
-    </w:p>
-    <w:p>
-      <w:pPr>
-        <w:spacing w:lineRule="auto" w:line="276" w:before="0" w:after="0"/>
-      </w:pPr>
-      <w:r>
-        <w:rPr>
-          <w:rFonts w:ascii="Arial" w:hAnsi="Arial" w:cs="Arial" w:eastAsia="Arial"/>
-          <w:b/>
-          <w:color w:val="000000"/>
-          <w:sz w:val="46"/>
-        </w:rPr>
-        <w:t>AND WHO'S BUYING IT? THE TV COMPANY'S OWN FINE PRINT SAYS IT!!</w:t>
-      </w:r>
-    </w:p>
-    <w:p>
-      <w:pPr>
-        <w:spacing w:lineRule="auto" w:line="276" w:before="0" w:after="0"/>
-      </w:pPr>
-      <w:r>
-        <w:rPr>
-          <w:rFonts w:ascii="Arial" w:hAnsi="Arial" w:cs="Arial" w:eastAsia="Arial"/>
-          <w:b w:val="0"/>
-          <w:color w:val="000000"/>
-          <w:sz w:val="36"/>
-        </w:rPr>
-      </w:r>
-    </w:p>
-    <w:p>
-      <w:pPr>
-        <w:spacing w:lineRule="auto" w:line="276" w:before="0" w:after="0"/>
-      </w:pPr>
-      <w:r>
-        <w:rPr>
-          <w:rFonts w:ascii="Arial" w:hAnsi="Arial" w:cs="Arial" w:eastAsia="Arial"/>
-          <w:b w:val="0"/>
-          <w:color w:val="000000"/>
-          <w:sz w:val="36"/>
-        </w:rPr>
-        <w:t xml:space="preserve">-WALMART OWNS </w:t>
-      </w:r>
-      <w:r>
-        <w:rPr>
-          <w:rFonts w:ascii="Arial" w:hAnsi="Arial" w:cs="Arial" w:eastAsia="Arial"/>
-          <w:b/>
-          <w:color w:val="000000"/>
-          <w:sz w:val="36"/>
-        </w:rPr>
-        <w:t>VIZIO</w:t>
-      </w:r>
-      <w:r>
-        <w:rPr>
-          <w:rFonts w:ascii="Arial" w:hAnsi="Arial" w:cs="Arial" w:eastAsia="Arial"/>
-          <w:b w:val="0"/>
-          <w:color w:val="000000"/>
-          <w:sz w:val="36"/>
-        </w:rPr>
-        <w:t xml:space="preserve"> NOW. IT BOUGHT THE TV MAKER FOR ABOUT </w:t>
-      </w:r>
-      <w:r>
-        <w:rPr>
-          <w:rFonts w:ascii="Arial" w:hAnsi="Arial" w:cs="Arial" w:eastAsia="Arial"/>
-          <w:b/>
-          <w:color w:val="000000"/>
-          <w:sz w:val="36"/>
-        </w:rPr>
-        <w:t>2.3 BILLION DOLLARS</w:t>
-      </w:r>
-      <w:r>
-        <w:rPr>
-          <w:rFonts w:ascii="Arial" w:hAnsi="Arial" w:cs="Arial" w:eastAsia="Arial"/>
-          <w:b w:val="0"/>
-          <w:color w:val="000000"/>
-          <w:sz w:val="36"/>
-        </w:rPr>
-        <w:t>.</w:t>
-      </w:r>
-    </w:p>
-    <w:p>
-      <w:pPr>
-        <w:spacing w:lineRule="auto" w:line="276" w:before="0" w:after="0"/>
-      </w:pPr>
-      <w:r>
-        <w:rPr>
-          <w:rFonts w:ascii="Arial" w:hAnsi="Arial" w:cs="Arial" w:eastAsia="Arial"/>
-          <w:b w:val="0"/>
-          <w:color w:val="000000"/>
-          <w:sz w:val="36"/>
-        </w:rPr>
-      </w:r>
-    </w:p>
-    <w:p>
-      <w:pPr>
-        <w:spacing w:lineRule="auto" w:line="276" w:before="0" w:after="0"/>
-      </w:pPr>
-      <w:r>
-        <w:rPr>
-          <w:rFonts w:ascii="Arial" w:hAnsi="Arial" w:cs="Arial" w:eastAsia="Arial"/>
-          <w:b w:val="0"/>
-          <w:color w:val="000000"/>
-          <w:sz w:val="36"/>
-        </w:rPr>
-        <w:t>-AND VIZIO'S OWN PRIVACY POLICY SPELLS OUT WHAT IT COLLECTS.</w:t>
-      </w:r>
-    </w:p>
-    <w:p>
-      <w:pPr>
-        <w:spacing w:lineRule="auto" w:line="276" w:before="0" w:after="0"/>
-      </w:pPr>
-      <w:r>
-        <w:rPr>
-          <w:rFonts w:ascii="Arial" w:hAnsi="Arial" w:cs="Arial" w:eastAsia="Arial"/>
-          <w:b w:val="0"/>
-          <w:color w:val="000000"/>
-          <w:sz w:val="36"/>
-        </w:rPr>
-      </w:r>
-    </w:p>
-    <w:p>
-      <w:pPr>
-        <w:spacing w:lineRule="auto" w:line="276" w:before="0" w:after="0"/>
-      </w:pPr>
-      <w:r>
-        <w:rPr>
-          <w:rFonts w:ascii="Arial" w:hAnsi="Arial" w:cs="Arial" w:eastAsia="Arial"/>
-          <w:b w:val="0"/>
-          <w:color w:val="000000"/>
-          <w:sz w:val="36"/>
-        </w:rPr>
-        <w:t>-SHOWS. COMMERCIALS. VIDEO GAMES. EVEN WHAT YOU PLUG INTO THE TV.</w:t>
-      </w:r>
-    </w:p>
-    <w:p>
-      <w:pPr>
-        <w:spacing w:lineRule="auto" w:line="276" w:before="0" w:after="0"/>
-      </w:pPr>
-      <w:r>
-        <w:rPr>
-          <w:rFonts w:ascii="Arial" w:hAnsi="Arial" w:cs="Arial" w:eastAsia="Arial"/>
-          <w:b w:val="0"/>
-          <w:color w:val="000000"/>
-          <w:sz w:val="36"/>
-        </w:rPr>
-      </w:r>
-    </w:p>
-    <w:p>
-      <w:pPr>
-        <w:spacing w:lineRule="auto" w:line="276" w:before="0" w:after="0"/>
-      </w:pPr>
-      <w:r>
-        <w:rPr>
-          <w:rFonts w:ascii="Arial" w:hAnsi="Arial" w:cs="Arial" w:eastAsia="Arial"/>
-          <w:b w:val="0"/>
-          <w:color w:val="000000"/>
-          <w:sz w:val="36"/>
-        </w:rPr>
-        <w:t xml:space="preserve">-IT CALLS ALL OF THAT </w:t>
-      </w:r>
-      <w:r>
-        <w:rPr>
-          <w:rFonts w:ascii="Arial" w:hAnsi="Arial" w:cs="Arial" w:eastAsia="Arial"/>
-          <w:b/>
-          <w:color w:val="000000"/>
-          <w:sz w:val="36"/>
-        </w:rPr>
-        <w:t>VIEWING DATA</w:t>
-      </w:r>
-      <w:r>
-        <w:rPr>
-          <w:rFonts w:ascii="Arial" w:hAnsi="Arial" w:cs="Arial" w:eastAsia="Arial"/>
-          <w:b w:val="0"/>
-          <w:color w:val="000000"/>
-          <w:sz w:val="36"/>
-        </w:rPr>
-        <w:t>.</w:t>
-      </w:r>
-    </w:p>
-    <w:p>
-      <w:pPr>
-        <w:spacing w:lineRule="auto" w:line="276" w:before="0" w:after="0"/>
-      </w:pPr>
-      <w:r>
-        <w:rPr>
-          <w:rFonts w:ascii="Arial" w:hAnsi="Arial" w:cs="Arial" w:eastAsia="Arial"/>
-          <w:b w:val="0"/>
-          <w:color w:val="000000"/>
-          <w:sz w:val="36"/>
-        </w:rPr>
-      </w:r>
-    </w:p>
-    <w:p>
-      <w:pPr>
-        <w:spacing w:lineRule="auto" w:line="276" w:before="0" w:after="0"/>
-      </w:pPr>
-      <w:r>
-        <w:rPr>
-          <w:rFonts w:ascii="Arial" w:hAnsi="Arial" w:cs="Arial" w:eastAsia="Arial"/>
-          <w:b w:val="0"/>
-          <w:color w:val="000000"/>
-          <w:sz w:val="36"/>
-        </w:rPr>
-        <w:t>-THIS CREATOR SAT DOWN AND READ THE WHOLE POLICY.</w:t>
-      </w:r>
-    </w:p>
-    <w:p>
-      <w:pPr>
-        <w:spacing w:lineRule="auto" w:line="276" w:before="0" w:after="0"/>
-      </w:pPr>
-      <w:r>
-        <w:rPr>
-          <w:rFonts w:ascii="Arial" w:hAnsi="Arial" w:cs="Arial" w:eastAsia="Arial"/>
-          <w:b w:val="0"/>
-          <w:color w:val="000000"/>
-          <w:sz w:val="36"/>
-        </w:rPr>
-      </w:r>
-    </w:p>
-    <w:p>
-      <w:pPr>
-        <w:spacing w:lineRule="auto" w:line="276" w:before="0" w:after="0"/>
-      </w:pPr>
-      <w:r>
-        <w:rPr>
-          <w:rFonts w:ascii="Arial" w:hAnsi="Arial" w:cs="Arial" w:eastAsia="Arial"/>
-          <w:b w:val="0"/>
-          <w:color w:val="000000"/>
-          <w:sz w:val="36"/>
-        </w:rPr>
-        <w:t>-SO WHO GETS YOUR VIEWING DATA… AND WHAT DO THEY ATTACH TO IT???</w:t>
-      </w:r>
-    </w:p>
-    <w:p>
-      <w:pPr>
-        <w:spacing w:lineRule="auto" w:line="276" w:before="0" w:after="0"/>
-      </w:pPr>
-      <w:r>
-        <w:rPr>
-          <w:rFonts w:ascii="Arial" w:hAnsi="Arial" w:cs="Arial" w:eastAsia="Arial"/>
-          <w:b w:val="0"/>
-          <w:color w:val="000000"/>
-          <w:sz w:val="36"/>
-        </w:rPr>
-      </w:r>
-    </w:p>
-    <w:p>
-      <w:pPr>
-        <w:spacing w:lineRule="auto" w:line="276" w:before="0" w:after="0"/>
-      </w:pPr>
-      <w:r>
-        <w:rPr>
-          <w:rFonts w:ascii="Arial" w:hAnsi="Arial" w:cs="Arial" w:eastAsia="Arial"/>
-          <w:b w:val="0"/>
-          <w:color w:val="000000"/>
-          <w:sz w:val="36"/>
-        </w:rPr>
-        <w:t>-LISTEN TO THIS.</w:t>
-      </w:r>
-    </w:p>
-    <w:p>
-      <w:pPr>
-        <w:spacing w:lineRule="auto" w:line="276" w:before="0" w:after="0"/>
-      </w:pPr>
-      <w:r>
-        <w:rPr>
-          <w:rFonts w:ascii="Arial" w:hAnsi="Arial" w:cs="Arial" w:eastAsia="Arial"/>
-          <w:b w:val="0"/>
-          <w:color w:val="000000"/>
-          <w:sz w:val="36"/>
-        </w:rPr>
+        <w:t>(((PLAY CLIP 1 HORIZONTAL)))</w:t>
       </w:r>
     </w:p>
     <w:p>
@@ -1344,7 +1224,20 @@
           <w:color w:val="FF0000"/>
           <w:sz w:val="36"/>
         </w:rPr>
-        <w:t>(((PLAY CLIP 1 HORIZONTAL)))</w:t>
+        <w:t>OUT: (GIVES THEM TO YOU)</w:t>
+      </w:r>
+    </w:p>
+    <w:p>
+      <w:pPr>
+        <w:spacing w:lineRule="auto" w:line="276" w:before="0" w:after="0"/>
+      </w:pPr>
+      <w:r>
+        <w:rPr>
+          <w:rFonts w:ascii="Arial" w:hAnsi="Arial" w:cs="Arial" w:eastAsia="Arial"/>
+          <w:b w:val="0"/>
+          <w:color w:val="000000"/>
+          <w:sz w:val="36"/>
+        </w:rPr>
       </w:r>
     </w:p>
     <w:p>
@@ -1358,36 +1251,9 @@
           <w:color w:val="FF0000"/>
           <w:sz w:val="36"/>
         </w:rPr>
-        <w:t>OUT: (GIVES THEM TO YOU)</w:t>
-      </w:r>
-    </w:p>
-    <w:p>
-      <w:pPr>
-        <w:spacing w:lineRule="auto" w:line="276" w:before="0" w:after="0"/>
-      </w:pPr>
-      <w:r>
-        <w:rPr>
-          <w:rFonts w:ascii="Arial" w:hAnsi="Arial" w:cs="Arial" w:eastAsia="Arial"/>
-          <w:b w:val="0"/>
-          <w:color w:val="000000"/>
-          <w:sz w:val="36"/>
-        </w:rPr>
-      </w:r>
-    </w:p>
-    <w:p>
-      <w:pPr>
-        <w:spacing w:lineRule="auto" w:line="276" w:before="0" w:after="0"/>
-      </w:pPr>
-      <w:r>
-        <w:rPr>
-          <w:rFonts w:ascii="Arial" w:hAnsi="Arial" w:cs="Arial" w:eastAsia="Arial"/>
-          <w:b/>
-          <w:color w:val="FF0000"/>
-          <w:sz w:val="36"/>
-        </w:rPr>
         <w:t>(((</w:t>
       </w:r>
-      <w:hyperlink r:id="rId10">
+      <w:hyperlink r:id="rId9">
         <w:r>
           <w:rPr>
             <w:color w:val="1155CC"/>
@@ -1425,7 +1291,7 @@
       <w:pPr>
         <w:spacing w:lineRule="auto" w:line="276" w:before="0" w:after="0"/>
       </w:pPr>
-      <w:commentRangeStart w:id="1"/>
+      <w:commentRangeStart w:id="0"/>
       <w:r>
         <w:rPr>
           <w:rFonts w:ascii="Arial" w:hAnsi="Arial" w:cs="Arial" w:eastAsia="Arial"/>
@@ -1435,12 +1301,12 @@
         </w:rPr>
         <w:t>-WHAT YOU WATCH… TIED TO WHO YOU ARE, WHERE YOU ARE AND WHAT YOU BUY!!</w:t>
       </w:r>
-      <w:commentRangeEnd w:id="1"/>
+      <w:commentRangeEnd w:id="0"/>
       <w:r>
         <w:rPr>
           <w:rStyle w:val="CommentReference"/>
         </w:rPr>
-        <w:commentReference w:id="1"/>
+        <w:commentReference w:id="0"/>
       </w:r>
     </w:p>
     <w:p>
@@ -1539,7 +1405,7 @@
           <w:color w:val="000000"/>
           <w:sz w:val="36"/>
         </w:rPr>
-        <w:t>-AND YOU CAN TURN IT OFF. LON WILL SHOW US WHERE IN A MINUTE.</w:t>
+        <w:t>-AND YOU CAN TURN IT OFF. A TECH EXPERT WILL SHOW YOU WHERE… IN A MINUTE.</w:t>
       </w:r>
     </w:p>
     <w:p>
@@ -1846,7 +1712,7 @@
       <w:pPr>
         <w:spacing w:lineRule="auto" w:line="276" w:before="0" w:after="0"/>
       </w:pPr>
-      <w:commentRangeStart w:id="2"/>
+      <w:commentRangeStart w:id="1"/>
       <w:r>
         <w:rPr>
           <w:rFonts w:ascii="Arial" w:hAnsi="Arial" w:cs="Arial" w:eastAsia="Arial"/>
@@ -1865,12 +1731,12 @@
         </w:rPr>
         <w:t>IN TEXAS.</w:t>
       </w:r>
-      <w:commentRangeEnd w:id="2"/>
+      <w:commentRangeEnd w:id="1"/>
       <w:r>
         <w:rPr>
           <w:rStyle w:val="CommentReference"/>
         </w:rPr>
-        <w:commentReference w:id="2"/>
+        <w:commentReference w:id="1"/>
       </w:r>
     </w:p>
     <w:p>
@@ -2303,7 +2169,7 @@
       <w:pPr>
         <w:spacing w:lineRule="auto" w:line="276" w:before="0" w:after="0"/>
       </w:pPr>
-      <w:commentRangeStart w:id="3"/>
+      <w:commentRangeStart w:id="2"/>
       <w:r>
         <w:rPr>
           <w:rFonts w:ascii="Arial" w:hAnsi="Arial" w:cs="Arial" w:eastAsia="Arial"/>
@@ -2331,12 +2197,12 @@
         </w:rPr>
         <w:t>."</w:t>
       </w:r>
-      <w:commentRangeEnd w:id="3"/>
+      <w:commentRangeEnd w:id="2"/>
       <w:r>
         <w:rPr>
           <w:rStyle w:val="CommentReference"/>
         </w:rPr>
-        <w:commentReference w:id="3"/>
+        <w:commentReference w:id="2"/>
       </w:r>
     </w:p>
     <w:p>
@@ -2490,7 +2356,79 @@
           <w:color w:val="000000"/>
           <w:sz w:val="46"/>
         </w:rPr>
-        <w:t>HERE'S HOW TO PROTECT YOURSELF</w:t>
+        <w:t>SO HOW WORRIED SHOULD YOU BE? THIS MAN REVIEWS TVS FOR A LIVING</w:t>
+      </w:r>
+    </w:p>
+    <w:p>
+      <w:pPr>
+        <w:spacing w:lineRule="auto" w:line="276" w:before="0" w:after="0"/>
+      </w:pPr>
+      <w:r>
+        <w:rPr>
+          <w:rFonts w:ascii="Arial" w:hAnsi="Arial" w:cs="Arial" w:eastAsia="Arial"/>
+          <w:b w:val="0"/>
+          <w:color w:val="000000"/>
+          <w:sz w:val="36"/>
+        </w:rPr>
+      </w:r>
+    </w:p>
+    <w:p>
+      <w:pPr>
+        <w:spacing w:lineRule="auto" w:line="276" w:before="0" w:after="0"/>
+      </w:pPr>
+      <w:r>
+        <w:rPr>
+          <w:rFonts w:ascii="Arial" w:hAnsi="Arial" w:cs="Arial" w:eastAsia="Arial"/>
+          <w:b w:val="0"/>
+          <w:color w:val="000000"/>
+          <w:sz w:val="36"/>
+        </w:rPr>
+        <w:t xml:space="preserve">-LON SEIDMAN REVIEWS TVS AND GADGETS ON HIS YOUTUBE CHANNEL, </w:t>
+      </w:r>
+      <w:r>
+        <w:rPr>
+          <w:rFonts w:ascii="Arial" w:hAnsi="Arial" w:cs="Arial" w:eastAsia="Arial"/>
+          <w:b/>
+          <w:color w:val="000000"/>
+          <w:sz w:val="36"/>
+        </w:rPr>
+        <w:t>LON.TV</w:t>
+      </w:r>
+      <w:r>
+        <w:rPr>
+          <w:rFonts w:ascii="Arial" w:hAnsi="Arial" w:cs="Arial" w:eastAsia="Arial"/>
+          <w:b w:val="0"/>
+          <w:color w:val="000000"/>
+          <w:sz w:val="36"/>
+        </w:rPr>
+        <w:t>.</w:t>
+      </w:r>
+    </w:p>
+    <w:p>
+      <w:pPr>
+        <w:spacing w:lineRule="auto" w:line="276" w:before="0" w:after="0"/>
+      </w:pPr>
+      <w:r>
+        <w:rPr>
+          <w:rFonts w:ascii="Arial" w:hAnsi="Arial" w:cs="Arial" w:eastAsia="Arial"/>
+          <w:b w:val="0"/>
+          <w:color w:val="000000"/>
+          <w:sz w:val="36"/>
+        </w:rPr>
+      </w:r>
+    </w:p>
+    <w:p>
+      <w:pPr>
+        <w:spacing w:lineRule="auto" w:line="276" w:before="0" w:after="0"/>
+      </w:pPr>
+      <w:r>
+        <w:rPr>
+          <w:rFonts w:ascii="Arial" w:hAnsi="Arial" w:cs="Arial" w:eastAsia="Arial"/>
+          <w:b w:val="0"/>
+          <w:color w:val="000000"/>
+          <w:sz w:val="36"/>
+        </w:rPr>
+        <w:t>-AND HE'S BEEN COVERING THIS STORY SINCE LAST YEAR.</w:t>
       </w:r>
     </w:p>
     <w:p>
@@ -2517,295 +2455,239 @@
           <w:color w:val="FF0000"/>
           <w:sz w:val="36"/>
         </w:rPr>
-        <w:t>(((INSERT GRAPHIC 001)))</w:t>
-      </w:r>
-    </w:p>
-    <w:p>
-      <w:pPr>
-        <w:spacing w:lineRule="auto" w:line="276" w:before="0" w:after="0"/>
-      </w:pPr>
-      <w:r>
-        <w:rPr>
-          <w:rFonts w:ascii="Arial" w:hAnsi="Arial" w:cs="Arial" w:eastAsia="Arial"/>
-          <w:b w:val="0"/>
-          <w:color w:val="000000"/>
-          <w:sz w:val="36"/>
-        </w:rPr>
-      </w:r>
-    </w:p>
-    <w:p>
-      <w:pPr>
-        <w:spacing w:lineRule="auto" w:line="276" w:before="0" w:after="0"/>
-      </w:pPr>
-      <w:r>
-        <w:rPr>
-          <w:rFonts w:ascii="Arial" w:hAnsi="Arial" w:cs="Arial" w:eastAsia="Arial"/>
-          <w:b w:val="0"/>
-          <w:color w:val="000000"/>
-          <w:sz w:val="36"/>
-        </w:rPr>
-        <w:t>-HERE'S THE ONE SETTING TO CHECK TONIGHT. LON, WHERE DO I FIND IT?</w:t>
-      </w:r>
-    </w:p>
-    <w:p>
-      <w:pPr>
-        <w:spacing w:lineRule="auto" w:line="276" w:before="0" w:after="0"/>
-      </w:pPr>
-      <w:r>
-        <w:rPr>
-          <w:rFonts w:ascii="Arial" w:hAnsi="Arial" w:cs="Arial" w:eastAsia="Arial"/>
-          <w:b w:val="0"/>
-          <w:color w:val="000000"/>
-          <w:sz w:val="36"/>
-        </w:rPr>
-      </w:r>
-    </w:p>
-    <w:p>
-      <w:pPr>
-        <w:spacing w:lineRule="auto" w:line="276" w:before="0" w:after="0"/>
-      </w:pPr>
-      <w:r>
-        <w:rPr>
-          <w:rFonts w:ascii="Arial" w:hAnsi="Arial" w:cs="Arial" w:eastAsia="Arial"/>
-          <w:b w:val="0"/>
-          <w:color w:val="000000"/>
-          <w:sz w:val="36"/>
-        </w:rPr>
-        <w:t xml:space="preserve">LON: LOOK IN </w:t>
-      </w:r>
+        <w:t>(((BRING IN LON)))</w:t>
+      </w:r>
+    </w:p>
+    <w:p>
+      <w:pPr>
+        <w:spacing w:lineRule="auto" w:line="276" w:before="0" w:after="0"/>
+      </w:pPr>
+      <w:r>
+        <w:rPr>
+          <w:rFonts w:ascii="Arial" w:hAnsi="Arial" w:cs="Arial" w:eastAsia="Arial"/>
+          <w:b w:val="0"/>
+          <w:color w:val="000000"/>
+          <w:sz w:val="36"/>
+        </w:rPr>
+      </w:r>
+    </w:p>
+    <w:p>
+      <w:pPr>
+        <w:spacing w:lineRule="auto" w:line="276" w:before="0" w:after="0"/>
+      </w:pPr>
+      <w:r>
+        <w:rPr>
+          <w:rFonts w:ascii="Arial" w:hAnsi="Arial" w:cs="Arial" w:eastAsia="Arial"/>
+          <w:b w:val="0"/>
+          <w:color w:val="000000"/>
+          <w:sz w:val="36"/>
+        </w:rPr>
+        <w:t>-LON, THANKS FOR BEING HERE.</w:t>
+      </w:r>
+    </w:p>
+    <w:p>
+      <w:pPr>
+        <w:spacing w:lineRule="auto" w:line="276" w:before="0" w:after="0"/>
+      </w:pPr>
+      <w:r>
+        <w:rPr>
+          <w:rFonts w:ascii="Arial" w:hAnsi="Arial" w:cs="Arial" w:eastAsia="Arial"/>
+          <w:b w:val="0"/>
+          <w:color w:val="000000"/>
+          <w:sz w:val="36"/>
+        </w:rPr>
+      </w:r>
+    </w:p>
+    <w:p>
+      <w:pPr>
+        <w:spacing w:lineRule="auto" w:line="276" w:before="0" w:after="0"/>
+      </w:pPr>
+      <w:r>
+        <w:rPr>
+          <w:rFonts w:ascii="Arial" w:hAnsi="Arial" w:cs="Arial" w:eastAsia="Arial"/>
+          <w:b w:val="0"/>
+          <w:color w:val="000000"/>
+          <w:sz w:val="36"/>
+        </w:rPr>
+        <w:t>JEFF: WHAT IS MY TV ACTUALLY DOING WHEN IT "WATCHES" ME?</w:t>
+      </w:r>
+    </w:p>
+    <w:p>
+      <w:pPr>
+        <w:spacing w:lineRule="auto" w:line="276" w:before="0" w:after="0"/>
+      </w:pPr>
+      <w:r>
+        <w:rPr>
+          <w:rFonts w:ascii="Arial" w:hAnsi="Arial" w:cs="Arial" w:eastAsia="Arial"/>
+          <w:b w:val="0"/>
+          <w:color w:val="000000"/>
+          <w:sz w:val="36"/>
+        </w:rPr>
+      </w:r>
+    </w:p>
+    <w:p>
+      <w:pPr>
+        <w:spacing w:lineRule="auto" w:line="276" w:before="0" w:after="0"/>
+      </w:pPr>
+      <w:commentRangeStart w:id="3"/>
+      <w:r>
+        <w:rPr>
+          <w:rFonts w:ascii="Arial" w:hAnsi="Arial" w:cs="Arial" w:eastAsia="Arial"/>
+          <w:b w:val="0"/>
+          <w:color w:val="000000"/>
+          <w:sz w:val="36"/>
+        </w:rPr>
+        <w:t>(LON EXPLAINS MECHANICS: ACR TAKES A TINY FINGERPRINT OF WHAT'S ON SCREEN AND MATCHES IT TO A DATABASE. ON BY DEFAULT ON MOST BIG BRANDS. IT WORKS EVEN WHEN THE TV IS JUST A SCREEN FOR A CABLE BOX OR STREAMING STICK. ONE 2024 STUDY CLOCKED LG SETS ABOUT EVERY 15 SECONDS)</w:t>
+      </w:r>
+      <w:commentRangeEnd w:id="3"/>
+      <w:r>
+        <w:rPr>
+          <w:rStyle w:val="CommentReference"/>
+        </w:rPr>
+        <w:commentReference w:id="3"/>
+      </w:r>
+    </w:p>
+    <w:p>
+      <w:pPr>
+        <w:spacing w:lineRule="auto" w:line="276" w:before="0" w:after="0"/>
+      </w:pPr>
+      <w:r>
+        <w:rPr>
+          <w:rFonts w:ascii="Arial" w:hAnsi="Arial" w:cs="Arial" w:eastAsia="Arial"/>
+          <w:b w:val="0"/>
+          <w:color w:val="000000"/>
+          <w:sz w:val="36"/>
+        </w:rPr>
+      </w:r>
+    </w:p>
+    <w:p>
+      <w:pPr>
+        <w:spacing w:lineRule="auto" w:line="276" w:before="0" w:after="0"/>
+      </w:pPr>
+      <w:r>
+        <w:rPr>
+          <w:rFonts w:ascii="Arial" w:hAnsi="Arial" w:cs="Arial" w:eastAsia="Arial"/>
+          <w:b w:val="0"/>
+          <w:color w:val="000000"/>
+          <w:sz w:val="36"/>
+        </w:rPr>
+        <w:t>JEFF: YOU COVERED THE TEXAS DEAL ON YOUR OWN CHANNEL. DID TEXANS ACTUALLY WIN?</w:t>
+      </w:r>
+    </w:p>
+    <w:p>
+      <w:pPr>
+        <w:spacing w:lineRule="auto" w:line="276" w:before="0" w:after="0"/>
+      </w:pPr>
+      <w:r>
+        <w:rPr>
+          <w:rFonts w:ascii="Arial" w:hAnsi="Arial" w:cs="Arial" w:eastAsia="Arial"/>
+          <w:b w:val="0"/>
+          <w:color w:val="000000"/>
+          <w:sz w:val="36"/>
+        </w:rPr>
+      </w:r>
+    </w:p>
+    <w:p>
+      <w:pPr>
+        <w:spacing w:lineRule="auto" w:line="276" w:before="0" w:after="0"/>
+      </w:pPr>
+      <w:commentRangeStart w:id="4"/>
+      <w:r>
+        <w:rPr>
+          <w:rFonts w:ascii="Arial" w:hAnsi="Arial" w:cs="Arial" w:eastAsia="Arial"/>
+          <w:b w:val="0"/>
+          <w:color w:val="000000"/>
+          <w:sz w:val="36"/>
+        </w:rPr>
+        <w:t>(LON ANSWERS: HIS READ OF THE LG SETTLEMENT. THE POP-UP ONLY COVERS LG'S 2027 AND NEWER MODELS. OLDER TVS MOSTLY KEEP THE SAME FLOW. THE DEAL EXPIRES AFTER 5 YEARS. SAMSUNG'S TERMS AREN'T PUBLIC)</w:t>
+      </w:r>
+      <w:commentRangeEnd w:id="4"/>
+      <w:r>
+        <w:rPr>
+          <w:rStyle w:val="CommentReference"/>
+        </w:rPr>
+        <w:commentReference w:id="4"/>
+      </w:r>
+    </w:p>
+    <w:p>
+      <w:pPr>
+        <w:spacing w:lineRule="auto" w:line="276" w:before="0" w:after="0"/>
+      </w:pPr>
+      <w:r>
+        <w:rPr>
+          <w:rFonts w:ascii="Arial" w:hAnsi="Arial" w:cs="Arial" w:eastAsia="Arial"/>
+          <w:b w:val="0"/>
+          <w:color w:val="000000"/>
+          <w:sz w:val="36"/>
+        </w:rPr>
+      </w:r>
+    </w:p>
+    <w:p>
+      <w:pPr>
+        <w:spacing w:lineRule="auto" w:line="276" w:before="0" w:after="0"/>
+      </w:pPr>
+      <w:r>
+        <w:rPr>
+          <w:rFonts w:ascii="Arial" w:hAnsi="Arial" w:cs="Arial" w:eastAsia="Arial"/>
+          <w:b w:val="0"/>
+          <w:color w:val="000000"/>
+          <w:sz w:val="36"/>
+        </w:rPr>
+        <w:t>JEFF: THOSE RESEARCHERS SAY AN LG TV CAN HEAR YOU. SHOULD PEOPLE BE WORRIED?</w:t>
+      </w:r>
+    </w:p>
+    <w:p>
+      <w:pPr>
+        <w:spacing w:lineRule="auto" w:line="276" w:before="0" w:after="0"/>
+      </w:pPr>
+      <w:r>
+        <w:rPr>
+          <w:rFonts w:ascii="Arial" w:hAnsi="Arial" w:cs="Arial" w:eastAsia="Arial"/>
+          <w:b w:val="0"/>
+          <w:color w:val="000000"/>
+          <w:sz w:val="36"/>
+        </w:rPr>
+      </w:r>
+    </w:p>
+    <w:p>
+      <w:pPr>
+        <w:spacing w:lineRule="auto" w:line="276" w:before="0" w:after="0"/>
+      </w:pPr>
+      <w:r>
+        <w:rPr>
+          <w:rFonts w:ascii="Arial" w:hAnsi="Arial" w:cs="Arial" w:eastAsia="Arial"/>
+          <w:b w:val="0"/>
+          <w:color w:val="000000"/>
+          <w:sz w:val="36"/>
+        </w:rPr>
+        <w:t>(LON ANSWERS: WHAT THE RESEARCHERS SHOWED VERSUS WHAT LG SAYS. THEIR DEMO NEEDED SOMEONE WITH REMOTE ACCESS THROUGH SECURITY HOLES. THE TRACKING IS THE PART THAT'S PROVEN)</w:t>
+      </w:r>
+    </w:p>
+    <w:p>
+      <w:pPr>
+        <w:spacing w:lineRule="auto" w:line="276" w:before="0" w:after="0"/>
+      </w:pPr>
+      <w:r>
+        <w:rPr>
+          <w:rFonts w:ascii="Arial" w:hAnsi="Arial" w:cs="Arial" w:eastAsia="Arial"/>
+          <w:b w:val="0"/>
+          <w:color w:val="000000"/>
+          <w:sz w:val="36"/>
+        </w:rPr>
+      </w:r>
+    </w:p>
+    <w:p>
+      <w:pPr>
+        <w:spacing w:lineRule="auto" w:line="276" w:before="0" w:after="0"/>
+      </w:pPr>
       <w:r>
         <w:rPr>
           <w:rFonts w:ascii="Arial" w:hAnsi="Arial" w:cs="Arial" w:eastAsia="Arial"/>
           <w:b/>
           <w:color w:val="000000"/>
-          <w:sz w:val="36"/>
-        </w:rPr>
-        <w:t>PRIVACY</w:t>
-      </w:r>
-      <w:r>
-        <w:rPr>
-          <w:rFonts w:ascii="Arial" w:hAnsi="Arial" w:cs="Arial" w:eastAsia="Arial"/>
-          <w:b w:val="0"/>
-          <w:color w:val="000000"/>
-          <w:sz w:val="36"/>
-        </w:rPr>
-        <w:t xml:space="preserve"> OR </w:t>
-      </w:r>
-      <w:r>
-        <w:rPr>
-          <w:rFonts w:ascii="Arial" w:hAnsi="Arial" w:cs="Arial" w:eastAsia="Arial"/>
-          <w:b/>
-          <w:color w:val="000000"/>
-          <w:sz w:val="36"/>
-        </w:rPr>
-        <w:t>VIEWING</w:t>
-      </w:r>
-      <w:r>
-        <w:rPr>
-          <w:rFonts w:ascii="Arial" w:hAnsi="Arial" w:cs="Arial" w:eastAsia="Arial"/>
-          <w:b w:val="0"/>
-          <w:color w:val="000000"/>
-          <w:sz w:val="36"/>
-        </w:rPr>
-        <w:t xml:space="preserve"> SETTINGS. THE NAME CHANGES BY BRAND… AND BY MODEL.</w:t>
-      </w:r>
-    </w:p>
-    <w:p>
-      <w:pPr>
-        <w:spacing w:lineRule="auto" w:line="276" w:before="0" w:after="0"/>
-      </w:pPr>
-      <w:r>
-        <w:rPr>
-          <w:rFonts w:ascii="Arial" w:hAnsi="Arial" w:cs="Arial" w:eastAsia="Arial"/>
-          <w:b w:val="0"/>
-          <w:color w:val="000000"/>
-          <w:sz w:val="36"/>
-        </w:rPr>
-      </w:r>
-    </w:p>
-    <w:p>
-      <w:pPr>
-        <w:spacing w:lineRule="auto" w:line="276" w:before="0" w:after="0"/>
-      </w:pPr>
-      <w:r>
-        <w:rPr>
-          <w:rFonts w:ascii="Arial" w:hAnsi="Arial" w:cs="Arial" w:eastAsia="Arial"/>
-          <w:b w:val="0"/>
-          <w:color w:val="000000"/>
-          <w:sz w:val="36"/>
-        </w:rPr>
-        <w:t xml:space="preserve">LON: SAMSUNG: </w:t>
-      </w:r>
-      <w:r>
-        <w:rPr>
-          <w:rFonts w:ascii="Arial" w:hAnsi="Arial" w:cs="Arial" w:eastAsia="Arial"/>
-          <w:b/>
-          <w:color w:val="000000"/>
-          <w:sz w:val="36"/>
-        </w:rPr>
-        <w:t>VIEWING INFORMATION SERVICES</w:t>
-      </w:r>
-      <w:r>
-        <w:rPr>
-          <w:rFonts w:ascii="Arial" w:hAnsi="Arial" w:cs="Arial" w:eastAsia="Arial"/>
-          <w:b w:val="0"/>
-          <w:color w:val="000000"/>
-          <w:sz w:val="36"/>
-        </w:rPr>
-        <w:t xml:space="preserve">. LG: </w:t>
-      </w:r>
-      <w:r>
-        <w:rPr>
-          <w:rFonts w:ascii="Arial" w:hAnsi="Arial" w:cs="Arial" w:eastAsia="Arial"/>
-          <w:b/>
-          <w:color w:val="000000"/>
-          <w:sz w:val="36"/>
-        </w:rPr>
-        <w:t>LIVE PLUS</w:t>
-      </w:r>
-      <w:r>
-        <w:rPr>
-          <w:rFonts w:ascii="Arial" w:hAnsi="Arial" w:cs="Arial" w:eastAsia="Arial"/>
-          <w:b w:val="0"/>
-          <w:color w:val="000000"/>
-          <w:sz w:val="36"/>
-        </w:rPr>
-        <w:t xml:space="preserve">. VIZIO: </w:t>
-      </w:r>
-      <w:r>
-        <w:rPr>
-          <w:rFonts w:ascii="Arial" w:hAnsi="Arial" w:cs="Arial" w:eastAsia="Arial"/>
-          <w:b/>
-          <w:color w:val="000000"/>
-          <w:sz w:val="36"/>
-        </w:rPr>
-        <w:t>VIEWING DATA</w:t>
-      </w:r>
-      <w:r>
-        <w:rPr>
-          <w:rFonts w:ascii="Arial" w:hAnsi="Arial" w:cs="Arial" w:eastAsia="Arial"/>
-          <w:b w:val="0"/>
-          <w:color w:val="000000"/>
-          <w:sz w:val="36"/>
-        </w:rPr>
-        <w:t>.</w:t>
-      </w:r>
-    </w:p>
-    <w:p>
-      <w:pPr>
-        <w:spacing w:lineRule="auto" w:line="276" w:before="0" w:after="0"/>
-      </w:pPr>
-      <w:r>
-        <w:rPr>
-          <w:rFonts w:ascii="Arial" w:hAnsi="Arial" w:cs="Arial" w:eastAsia="Arial"/>
-          <w:b w:val="0"/>
-          <w:color w:val="000000"/>
-          <w:sz w:val="36"/>
-        </w:rPr>
-      </w:r>
-    </w:p>
-    <w:p>
-      <w:pPr>
-        <w:spacing w:lineRule="auto" w:line="276" w:before="0" w:after="0"/>
-      </w:pPr>
-      <w:r>
-        <w:rPr>
-          <w:rFonts w:ascii="Arial" w:hAnsi="Arial" w:cs="Arial" w:eastAsia="Arial"/>
-          <w:b w:val="0"/>
-          <w:color w:val="000000"/>
-          <w:sz w:val="36"/>
-        </w:rPr>
-        <w:t xml:space="preserve">LON: ROKU TVS: </w:t>
-      </w:r>
-      <w:r>
-        <w:rPr>
-          <w:rFonts w:ascii="Arial" w:hAnsi="Arial" w:cs="Arial" w:eastAsia="Arial"/>
-          <w:b/>
-          <w:color w:val="000000"/>
-          <w:sz w:val="36"/>
-        </w:rPr>
-        <w:t>USE INFO FROM TV INPUTS</w:t>
-      </w:r>
-      <w:r>
-        <w:rPr>
-          <w:rFonts w:ascii="Arial" w:hAnsi="Arial" w:cs="Arial" w:eastAsia="Arial"/>
-          <w:b w:val="0"/>
-          <w:color w:val="000000"/>
-          <w:sz w:val="36"/>
-        </w:rPr>
-        <w:t xml:space="preserve">. SONY: </w:t>
-      </w:r>
-      <w:r>
-        <w:rPr>
-          <w:rFonts w:ascii="Arial" w:hAnsi="Arial" w:cs="Arial" w:eastAsia="Arial"/>
-          <w:b/>
-          <w:color w:val="000000"/>
-          <w:sz w:val="36"/>
-        </w:rPr>
-        <w:t>SAMBA INTERACTIVE TV</w:t>
-      </w:r>
-      <w:r>
-        <w:rPr>
-          <w:rFonts w:ascii="Arial" w:hAnsi="Arial" w:cs="Arial" w:eastAsia="Arial"/>
-          <w:b w:val="0"/>
-          <w:color w:val="000000"/>
-          <w:sz w:val="36"/>
-        </w:rPr>
-        <w:t>. TURN IT OFF.</w:t>
-      </w:r>
-    </w:p>
-    <w:p>
-      <w:pPr>
-        <w:spacing w:lineRule="auto" w:line="276" w:before="0" w:after="0"/>
-      </w:pPr>
-      <w:r>
-        <w:rPr>
-          <w:rFonts w:ascii="Arial" w:hAnsi="Arial" w:cs="Arial" w:eastAsia="Arial"/>
-          <w:b w:val="0"/>
-          <w:color w:val="000000"/>
-          <w:sz w:val="36"/>
-        </w:rPr>
-      </w:r>
-    </w:p>
-    <w:p>
-      <w:pPr>
-        <w:spacing w:lineRule="auto" w:line="276" w:before="0" w:after="0"/>
-      </w:pPr>
-      <w:r>
-        <w:rPr>
-          <w:rFonts w:ascii="Arial" w:hAnsi="Arial" w:cs="Arial" w:eastAsia="Arial"/>
-          <w:b w:val="0"/>
-          <w:color w:val="000000"/>
-          <w:sz w:val="36"/>
-        </w:rPr>
-        <w:t>-AND IF MY TV DOESN'T HAVE THAT SETTING AT ALL?</w:t>
-      </w:r>
-    </w:p>
-    <w:p>
-      <w:pPr>
-        <w:spacing w:lineRule="auto" w:line="276" w:before="0" w:after="0"/>
-      </w:pPr>
-      <w:r>
-        <w:rPr>
-          <w:rFonts w:ascii="Arial" w:hAnsi="Arial" w:cs="Arial" w:eastAsia="Arial"/>
-          <w:b w:val="0"/>
-          <w:color w:val="000000"/>
-          <w:sz w:val="36"/>
-        </w:rPr>
-      </w:r>
-    </w:p>
-    <w:p>
-      <w:pPr>
-        <w:spacing w:lineRule="auto" w:line="276" w:before="0" w:after="0"/>
-      </w:pPr>
-      <w:r>
-        <w:rPr>
-          <w:rFonts w:ascii="Arial" w:hAnsi="Arial" w:cs="Arial" w:eastAsia="Arial"/>
-          <w:b w:val="0"/>
-          <w:color w:val="000000"/>
-          <w:sz w:val="36"/>
-        </w:rPr>
-        <w:t>LON: (HIS FALLBACK FOR A TV WITH NO OFF SWITCH)</w:t>
+          <w:sz w:val="46"/>
+        </w:rPr>
+        <w:t>HERE'S HOW TO PROTECT YOURSELF</w:t>
       </w:r>
     </w:p>
     <w:p>
@@ -2832,142 +2714,115 @@
           <w:color w:val="FF0000"/>
           <w:sz w:val="36"/>
         </w:rPr>
-        <w:t>(((PRODUCER - LON TO CONFIRM THE NO-SETTING FALLBACK BEFORE TAPING, E.G. TAKE THE TV OFF WI-FI AND USE A STREAMING DEVICE. UNSOURCED)))</w:t>
-      </w:r>
-    </w:p>
-    <w:p>
-      <w:pPr>
-        <w:spacing w:lineRule="auto" w:line="276" w:before="0" w:after="0"/>
-      </w:pPr>
-      <w:r>
-        <w:rPr>
-          <w:rFonts w:ascii="Arial" w:hAnsi="Arial" w:cs="Arial" w:eastAsia="Arial"/>
-          <w:b w:val="0"/>
-          <w:color w:val="000000"/>
-          <w:sz w:val="36"/>
-        </w:rPr>
-      </w:r>
-    </w:p>
-    <w:p>
-      <w:pPr>
-        <w:spacing w:lineRule="auto" w:line="276" w:before="0" w:after="0"/>
-      </w:pPr>
-      <w:r>
-        <w:rPr>
-          <w:rFonts w:ascii="Arial" w:hAnsi="Arial" w:cs="Arial" w:eastAsia="Arial"/>
-          <w:b w:val="0"/>
-          <w:color w:val="000000"/>
-          <w:sz w:val="36"/>
-        </w:rPr>
-        <w:t>-DOES TURNING IT OFF BREAK ANYTHING?</w:t>
-      </w:r>
-    </w:p>
-    <w:p>
-      <w:pPr>
-        <w:spacing w:lineRule="auto" w:line="276" w:before="0" w:after="0"/>
-      </w:pPr>
-      <w:r>
-        <w:rPr>
-          <w:rFonts w:ascii="Arial" w:hAnsi="Arial" w:cs="Arial" w:eastAsia="Arial"/>
-          <w:b w:val="0"/>
-          <w:color w:val="000000"/>
-          <w:sz w:val="36"/>
-        </w:rPr>
-      </w:r>
-    </w:p>
-    <w:p>
-      <w:pPr>
-        <w:spacing w:lineRule="auto" w:line="276" w:before="0" w:after="0"/>
-      </w:pPr>
-      <w:r>
-        <w:rPr>
-          <w:rFonts w:ascii="Arial" w:hAnsi="Arial" w:cs="Arial" w:eastAsia="Arial"/>
-          <w:b w:val="0"/>
-          <w:color w:val="000000"/>
-          <w:sz w:val="36"/>
-        </w:rPr>
-        <w:t>LON: NO. THE TV WORKS THE SAME. YOU STILL GET ADS… THEY'RE JUST LESS TARGETED.</w:t>
-      </w:r>
-    </w:p>
-    <w:p>
-      <w:pPr>
-        <w:spacing w:lineRule="auto" w:line="276" w:before="0" w:after="0"/>
-      </w:pPr>
-      <w:r>
-        <w:rPr>
-          <w:rFonts w:ascii="Arial" w:hAnsi="Arial" w:cs="Arial" w:eastAsia="Arial"/>
-          <w:b w:val="0"/>
-          <w:color w:val="000000"/>
-          <w:sz w:val="36"/>
-        </w:rPr>
-      </w:r>
-    </w:p>
-    <w:p>
-      <w:pPr>
-        <w:spacing w:lineRule="auto" w:line="276" w:before="0" w:after="0"/>
-      </w:pPr>
-      <w:r>
-        <w:rPr>
-          <w:rFonts w:ascii="Arial" w:hAnsi="Arial" w:cs="Arial" w:eastAsia="Arial"/>
-          <w:b w:val="0"/>
-          <w:color w:val="000000"/>
-          <w:sz w:val="36"/>
-        </w:rPr>
-        <w:t>-AND THE MICROPHONE?</w:t>
-      </w:r>
-    </w:p>
-    <w:p>
-      <w:pPr>
-        <w:spacing w:lineRule="auto" w:line="276" w:before="0" w:after="0"/>
-      </w:pPr>
-      <w:r>
-        <w:rPr>
-          <w:rFonts w:ascii="Arial" w:hAnsi="Arial" w:cs="Arial" w:eastAsia="Arial"/>
-          <w:b w:val="0"/>
-          <w:color w:val="000000"/>
-          <w:sz w:val="36"/>
-        </w:rPr>
-      </w:r>
-    </w:p>
-    <w:p>
-      <w:pPr>
-        <w:spacing w:lineRule="auto" w:line="276" w:before="0" w:after="0"/>
-      </w:pPr>
-      <w:r>
-        <w:rPr>
-          <w:rFonts w:ascii="Arial" w:hAnsi="Arial" w:cs="Arial" w:eastAsia="Arial"/>
-          <w:b w:val="0"/>
-          <w:color w:val="000000"/>
-          <w:sz w:val="36"/>
-        </w:rPr>
-        <w:t>LON: (THE MIC SETTING WORTH CHECKING. ROKU: MICROPHONE ACCESS, NEVER ALLOW. SOME SAMSUNG SETS HAVE A PHYSICAL MIC SWITCH. LON TO CONFIRM)</w:t>
-      </w:r>
-    </w:p>
-    <w:p>
-      <w:pPr>
-        <w:spacing w:lineRule="auto" w:line="276" w:before="0" w:after="0"/>
-      </w:pPr>
-      <w:r>
-        <w:rPr>
-          <w:rFonts w:ascii="Arial" w:hAnsi="Arial" w:cs="Arial" w:eastAsia="Arial"/>
-          <w:b w:val="0"/>
-          <w:color w:val="000000"/>
-          <w:sz w:val="36"/>
-        </w:rPr>
-      </w:r>
-    </w:p>
-    <w:p>
-      <w:pPr>
-        <w:spacing w:lineRule="auto" w:line="276" w:before="0" w:after="0"/>
-      </w:pPr>
-      <w:r>
-        <w:rPr>
-          <w:rFonts w:ascii="Arial" w:hAnsi="Arial" w:cs="Arial" w:eastAsia="Arial"/>
-          <w:b w:val="0"/>
-          <w:color w:val="000000"/>
-          <w:sz w:val="36"/>
-        </w:rPr>
-        <w:t>-LON SEIDMAN, THANK YOU.</w:t>
+        <w:t>(((INSERT GRAPHIC 001)))</w:t>
+      </w:r>
+    </w:p>
+    <w:p>
+      <w:pPr>
+        <w:spacing w:lineRule="auto" w:line="276" w:before="0" w:after="0"/>
+      </w:pPr>
+      <w:r>
+        <w:rPr>
+          <w:rFonts w:ascii="Arial" w:hAnsi="Arial" w:cs="Arial" w:eastAsia="Arial"/>
+          <w:b w:val="0"/>
+          <w:color w:val="000000"/>
+          <w:sz w:val="36"/>
+        </w:rPr>
+      </w:r>
+    </w:p>
+    <w:p>
+      <w:pPr>
+        <w:spacing w:lineRule="auto" w:line="276" w:before="0" w:after="0"/>
+      </w:pPr>
+      <w:r>
+        <w:rPr>
+          <w:rFonts w:ascii="Arial" w:hAnsi="Arial" w:cs="Arial" w:eastAsia="Arial"/>
+          <w:b w:val="0"/>
+          <w:color w:val="000000"/>
+          <w:sz w:val="36"/>
+        </w:rPr>
+        <w:t>JEFF: HERE'S THE ONE SETTING TO CHECK TONIGHT. LON, WHERE DO I FIND IT?</w:t>
+      </w:r>
+    </w:p>
+    <w:p>
+      <w:pPr>
+        <w:spacing w:lineRule="auto" w:line="276" w:before="0" w:after="0"/>
+      </w:pPr>
+      <w:r>
+        <w:rPr>
+          <w:rFonts w:ascii="Arial" w:hAnsi="Arial" w:cs="Arial" w:eastAsia="Arial"/>
+          <w:b w:val="0"/>
+          <w:color w:val="000000"/>
+          <w:sz w:val="36"/>
+        </w:rPr>
+      </w:r>
+    </w:p>
+    <w:p>
+      <w:pPr>
+        <w:spacing w:lineRule="auto" w:line="276" w:before="0" w:after="0"/>
+      </w:pPr>
+      <w:r>
+        <w:rPr>
+          <w:rFonts w:ascii="Arial" w:hAnsi="Arial" w:cs="Arial" w:eastAsia="Arial"/>
+          <w:b w:val="0"/>
+          <w:color w:val="000000"/>
+          <w:sz w:val="36"/>
+        </w:rPr>
+        <w:t>(LON WALKS THROUGH IT: LOOK IN PRIVACY OR VIEWING SETTINGS. SAMSUNG: VIEWING INFORMATION SERVICES. LG: LIVE PLUS. VIZIO: VIEWING DATA. ROKU TVS: USE INFO FROM TV INPUTS. SONY: SAMBA INTERACTIVE TV. THE NAMES CHANGE BY MODEL)</w:t>
+      </w:r>
+    </w:p>
+    <w:p>
+      <w:pPr>
+        <w:spacing w:lineRule="auto" w:line="276" w:before="0" w:after="0"/>
+      </w:pPr>
+      <w:r>
+        <w:rPr>
+          <w:rFonts w:ascii="Arial" w:hAnsi="Arial" w:cs="Arial" w:eastAsia="Arial"/>
+          <w:b w:val="0"/>
+          <w:color w:val="000000"/>
+          <w:sz w:val="36"/>
+        </w:rPr>
+      </w:r>
+    </w:p>
+    <w:p>
+      <w:pPr>
+        <w:spacing w:lineRule="auto" w:line="276" w:before="0" w:after="0"/>
+      </w:pPr>
+      <w:r>
+        <w:rPr>
+          <w:rFonts w:ascii="Arial" w:hAnsi="Arial" w:cs="Arial" w:eastAsia="Arial"/>
+          <w:b w:val="0"/>
+          <w:color w:val="000000"/>
+          <w:sz w:val="36"/>
+        </w:rPr>
+        <w:t>JEFF: AND IF MY TV DOESN'T HAVE THAT SETTING AT ALL?</w:t>
+      </w:r>
+    </w:p>
+    <w:p>
+      <w:pPr>
+        <w:spacing w:lineRule="auto" w:line="276" w:before="0" w:after="0"/>
+      </w:pPr>
+      <w:r>
+        <w:rPr>
+          <w:rFonts w:ascii="Arial" w:hAnsi="Arial" w:cs="Arial" w:eastAsia="Arial"/>
+          <w:b w:val="0"/>
+          <w:color w:val="000000"/>
+          <w:sz w:val="36"/>
+        </w:rPr>
+      </w:r>
+    </w:p>
+    <w:p>
+      <w:pPr>
+        <w:spacing w:lineRule="auto" w:line="276" w:before="0" w:after="0"/>
+      </w:pPr>
+      <w:r>
+        <w:rPr>
+          <w:rFonts w:ascii="Arial" w:hAnsi="Arial" w:cs="Arial" w:eastAsia="Arial"/>
+          <w:b w:val="0"/>
+          <w:color w:val="000000"/>
+          <w:sz w:val="36"/>
+        </w:rPr>
+        <w:t>(LON ANSWERS: HIS FALLBACK FOR A TV WITH NO OFF SWITCH)</w:t>
       </w:r>
     </w:p>
     <w:p>
@@ -2994,6 +2849,338 @@
           <w:color w:val="FF0000"/>
           <w:sz w:val="36"/>
         </w:rPr>
+        <w:t>(((PRODUCER - LON TO CONFIRM THE NO-SETTING FALLBACK BEFORE TAPING, E.G. TAKE THE TV OFF WI-FI AND USE A STREAMING DEVICE. UNSOURCED)))</w:t>
+      </w:r>
+    </w:p>
+    <w:p>
+      <w:pPr>
+        <w:spacing w:lineRule="auto" w:line="276" w:before="0" w:after="0"/>
+      </w:pPr>
+      <w:r>
+        <w:rPr>
+          <w:rFonts w:ascii="Arial" w:hAnsi="Arial" w:cs="Arial" w:eastAsia="Arial"/>
+          <w:b w:val="0"/>
+          <w:color w:val="000000"/>
+          <w:sz w:val="36"/>
+        </w:rPr>
+      </w:r>
+    </w:p>
+    <w:p>
+      <w:pPr>
+        <w:spacing w:lineRule="auto" w:line="276" w:before="0" w:after="0"/>
+      </w:pPr>
+      <w:r>
+        <w:rPr>
+          <w:rFonts w:ascii="Arial" w:hAnsi="Arial" w:cs="Arial" w:eastAsia="Arial"/>
+          <w:b w:val="0"/>
+          <w:color w:val="000000"/>
+          <w:sz w:val="36"/>
+        </w:rPr>
+        <w:t>JEFF: IF I TURN IT OFF, DOES ANYTHING STOP WORKING?</w:t>
+      </w:r>
+    </w:p>
+    <w:p>
+      <w:pPr>
+        <w:spacing w:lineRule="auto" w:line="276" w:before="0" w:after="0"/>
+      </w:pPr>
+      <w:r>
+        <w:rPr>
+          <w:rFonts w:ascii="Arial" w:hAnsi="Arial" w:cs="Arial" w:eastAsia="Arial"/>
+          <w:b w:val="0"/>
+          <w:color w:val="000000"/>
+          <w:sz w:val="36"/>
+        </w:rPr>
+      </w:r>
+    </w:p>
+    <w:p>
+      <w:pPr>
+        <w:spacing w:lineRule="auto" w:line="276" w:before="0" w:after="0"/>
+      </w:pPr>
+      <w:commentRangeStart w:id="5"/>
+      <w:r>
+        <w:rPr>
+          <w:rFonts w:ascii="Arial" w:hAnsi="Arial" w:cs="Arial" w:eastAsia="Arial"/>
+          <w:b w:val="0"/>
+          <w:color w:val="000000"/>
+          <w:sz w:val="36"/>
+        </w:rPr>
+        <w:t>(LON ANSWERS: VIZIO SAYS NO. BUT ON HIS LG, SAYING NO TO THE WHOLE USER AGREEMENT LOCKED HIM OUT OF APPS. SO TURN OFF THE VIEWING SETTING, DON'T REFUSE EVERYTHING)</w:t>
+      </w:r>
+      <w:commentRangeEnd w:id="5"/>
+      <w:r>
+        <w:rPr>
+          <w:rStyle w:val="CommentReference"/>
+        </w:rPr>
+        <w:commentReference w:id="5"/>
+      </w:r>
+    </w:p>
+    <w:p>
+      <w:pPr>
+        <w:spacing w:lineRule="auto" w:line="276" w:before="0" w:after="0"/>
+      </w:pPr>
+      <w:r>
+        <w:rPr>
+          <w:rFonts w:ascii="Arial" w:hAnsi="Arial" w:cs="Arial" w:eastAsia="Arial"/>
+          <w:b w:val="0"/>
+          <w:color w:val="000000"/>
+          <w:sz w:val="36"/>
+        </w:rPr>
+      </w:r>
+    </w:p>
+    <w:p>
+      <w:pPr>
+        <w:spacing w:lineRule="auto" w:line="276" w:before="0" w:after="0"/>
+      </w:pPr>
+      <w:r>
+        <w:rPr>
+          <w:rFonts w:ascii="Arial" w:hAnsi="Arial" w:cs="Arial" w:eastAsia="Arial"/>
+          <w:b w:val="0"/>
+          <w:color w:val="000000"/>
+          <w:sz w:val="36"/>
+        </w:rPr>
+        <w:t>JEFF: AND THE MICROPHONE?</w:t>
+      </w:r>
+    </w:p>
+    <w:p>
+      <w:pPr>
+        <w:spacing w:lineRule="auto" w:line="276" w:before="0" w:after="0"/>
+      </w:pPr>
+      <w:r>
+        <w:rPr>
+          <w:rFonts w:ascii="Arial" w:hAnsi="Arial" w:cs="Arial" w:eastAsia="Arial"/>
+          <w:b w:val="0"/>
+          <w:color w:val="000000"/>
+          <w:sz w:val="36"/>
+        </w:rPr>
+      </w:r>
+    </w:p>
+    <w:p>
+      <w:pPr>
+        <w:spacing w:lineRule="auto" w:line="276" w:before="0" w:after="0"/>
+      </w:pPr>
+      <w:r>
+        <w:rPr>
+          <w:rFonts w:ascii="Arial" w:hAnsi="Arial" w:cs="Arial" w:eastAsia="Arial"/>
+          <w:b w:val="0"/>
+          <w:color w:val="000000"/>
+          <w:sz w:val="36"/>
+        </w:rPr>
+        <w:t>(LON ANSWERS: THE MIC SETTING WORTH CHECKING. ROKU: MICROPHONE ACCESS, NEVER ALLOW. SOME SAMSUNG SETS HAVE A PHYSICAL MIC SWITCH. LON TO CONFIRM)</w:t>
+      </w:r>
+    </w:p>
+    <w:p>
+      <w:pPr>
+        <w:spacing w:lineRule="auto" w:line="276" w:before="0" w:after="0"/>
+      </w:pPr>
+      <w:r>
+        <w:rPr>
+          <w:rFonts w:ascii="Arial" w:hAnsi="Arial" w:cs="Arial" w:eastAsia="Arial"/>
+          <w:b w:val="0"/>
+          <w:color w:val="000000"/>
+          <w:sz w:val="36"/>
+        </w:rPr>
+      </w:r>
+    </w:p>
+    <w:p>
+      <w:pPr>
+        <w:spacing w:lineRule="auto" w:line="276" w:before="0" w:after="0"/>
+      </w:pPr>
+      <w:r>
+        <w:rPr>
+          <w:rFonts w:ascii="Arial" w:hAnsi="Arial" w:cs="Arial" w:eastAsia="Arial"/>
+          <w:b/>
+          <w:color w:val="000000"/>
+          <w:sz w:val="46"/>
+        </w:rPr>
+        <w:t>LON SEIDMAN QUESTIONS</w:t>
+      </w:r>
+    </w:p>
+    <w:p>
+      <w:pPr>
+        <w:spacing w:lineRule="auto" w:line="276" w:before="0" w:after="0"/>
+      </w:pPr>
+      <w:r>
+        <w:rPr>
+          <w:rFonts w:ascii="Arial" w:hAnsi="Arial" w:cs="Arial" w:eastAsia="Arial"/>
+          <w:b w:val="0"/>
+          <w:color w:val="000000"/>
+          <w:sz w:val="36"/>
+        </w:rPr>
+      </w:r>
+    </w:p>
+    <w:p>
+      <w:pPr>
+        <w:spacing w:lineRule="auto" w:line="276" w:before="0" w:after="0"/>
+      </w:pPr>
+      <w:r>
+        <w:rPr>
+          <w:rFonts w:ascii="Arial" w:hAnsi="Arial" w:cs="Arial" w:eastAsia="Arial"/>
+          <w:b w:val="0"/>
+          <w:color w:val="000000"/>
+          <w:sz w:val="36"/>
+        </w:rPr>
+        <w:t>-NUMBER ONE. I WATCH ON A STREAMING STICK. IS THAT TRACKING ME TOO?</w:t>
+      </w:r>
+    </w:p>
+    <w:p>
+      <w:pPr>
+        <w:spacing w:lineRule="auto" w:line="276" w:before="0" w:after="0"/>
+      </w:pPr>
+      <w:r>
+        <w:rPr>
+          <w:rFonts w:ascii="Arial" w:hAnsi="Arial" w:cs="Arial" w:eastAsia="Arial"/>
+          <w:b w:val="0"/>
+          <w:color w:val="000000"/>
+          <w:sz w:val="36"/>
+        </w:rPr>
+      </w:r>
+    </w:p>
+    <w:p>
+      <w:pPr>
+        <w:spacing w:lineRule="auto" w:line="276" w:before="0" w:after="0"/>
+      </w:pPr>
+      <w:r>
+        <w:rPr>
+          <w:rFonts w:ascii="Arial" w:hAnsi="Arial" w:cs="Arial" w:eastAsia="Arial"/>
+          <w:b w:val="0"/>
+          <w:color w:val="000000"/>
+          <w:sz w:val="36"/>
+        </w:rPr>
+        <w:t>-NUMBER TWO. A LOT OF PEOPLE ARE BUYING A NEW TV FOR THE HOLIDAYS. WHAT SHOULD THEY LOOK FOR?</w:t>
+      </w:r>
+    </w:p>
+    <w:p>
+      <w:pPr>
+        <w:spacing w:lineRule="auto" w:line="276" w:before="0" w:after="0"/>
+      </w:pPr>
+      <w:r>
+        <w:rPr>
+          <w:rFonts w:ascii="Arial" w:hAnsi="Arial" w:cs="Arial" w:eastAsia="Arial"/>
+          <w:b w:val="0"/>
+          <w:color w:val="000000"/>
+          <w:sz w:val="36"/>
+        </w:rPr>
+      </w:r>
+    </w:p>
+    <w:p>
+      <w:pPr>
+        <w:spacing w:lineRule="auto" w:line="276" w:before="0" w:after="0"/>
+      </w:pPr>
+      <w:r>
+        <w:rPr>
+          <w:rFonts w:ascii="Arial" w:hAnsi="Arial" w:cs="Arial" w:eastAsia="Arial"/>
+          <w:b w:val="0"/>
+          <w:color w:val="000000"/>
+          <w:sz w:val="36"/>
+        </w:rPr>
+        <w:t>-NUMBER THREE. WHAT ABOUT THE OTHER SMART STUFF IN MY HOUSE? THE SPEAKER… THE DOORBELL?</w:t>
+      </w:r>
+    </w:p>
+    <w:p>
+      <w:pPr>
+        <w:spacing w:lineRule="auto" w:line="276" w:before="0" w:after="0"/>
+      </w:pPr>
+      <w:r>
+        <w:rPr>
+          <w:rFonts w:ascii="Arial" w:hAnsi="Arial" w:cs="Arial" w:eastAsia="Arial"/>
+          <w:b w:val="0"/>
+          <w:color w:val="000000"/>
+          <w:sz w:val="36"/>
+        </w:rPr>
+      </w:r>
+    </w:p>
+    <w:p>
+      <w:pPr>
+        <w:spacing w:lineRule="auto" w:line="276" w:before="0" w:after="0"/>
+      </w:pPr>
+      <w:r>
+        <w:rPr>
+          <w:rFonts w:ascii="Arial" w:hAnsi="Arial" w:cs="Arial" w:eastAsia="Arial"/>
+          <w:b w:val="0"/>
+          <w:color w:val="000000"/>
+          <w:sz w:val="36"/>
+        </w:rPr>
+        <w:t>-NUMBER FOUR. IF SOMEONE DOES ONE THING TONIGHT, WHAT IS IT?</w:t>
+      </w:r>
+    </w:p>
+    <w:p>
+      <w:pPr>
+        <w:spacing w:lineRule="auto" w:line="276" w:before="0" w:after="0"/>
+      </w:pPr>
+      <w:r>
+        <w:rPr>
+          <w:rFonts w:ascii="Arial" w:hAnsi="Arial" w:cs="Arial" w:eastAsia="Arial"/>
+          <w:b w:val="0"/>
+          <w:color w:val="000000"/>
+          <w:sz w:val="36"/>
+        </w:rPr>
+      </w:r>
+    </w:p>
+    <w:p>
+      <w:pPr>
+        <w:spacing w:lineRule="auto" w:line="276" w:before="0" w:after="0"/>
+      </w:pPr>
+      <w:r>
+        <w:rPr>
+          <w:rFonts w:ascii="Arial" w:hAnsi="Arial" w:cs="Arial" w:eastAsia="Arial"/>
+          <w:b w:val="0"/>
+          <w:color w:val="000000"/>
+          <w:sz w:val="36"/>
+        </w:rPr>
+        <w:t>(LON ANSWERS EACH. JEFF: READ ONE VIEWER QUESTION IF THERE'S TIME)</w:t>
+      </w:r>
+    </w:p>
+    <w:p>
+      <w:pPr>
+        <w:spacing w:lineRule="auto" w:line="276" w:before="0" w:after="0"/>
+      </w:pPr>
+      <w:r>
+        <w:rPr>
+          <w:rFonts w:ascii="Arial" w:hAnsi="Arial" w:cs="Arial" w:eastAsia="Arial"/>
+          <w:b w:val="0"/>
+          <w:color w:val="000000"/>
+          <w:sz w:val="36"/>
+        </w:rPr>
+      </w:r>
+    </w:p>
+    <w:p>
+      <w:pPr>
+        <w:spacing w:lineRule="auto" w:line="276" w:before="0" w:after="0"/>
+      </w:pPr>
+      <w:r>
+        <w:rPr>
+          <w:rFonts w:ascii="Arial" w:hAnsi="Arial" w:cs="Arial" w:eastAsia="Arial"/>
+          <w:b w:val="0"/>
+          <w:color w:val="000000"/>
+          <w:sz w:val="36"/>
+        </w:rPr>
+        <w:t>-LON SEIDMAN, THANK YOU.</w:t>
+      </w:r>
+    </w:p>
+    <w:p>
+      <w:pPr>
+        <w:spacing w:lineRule="auto" w:line="276" w:before="0" w:after="0"/>
+      </w:pPr>
+      <w:r>
+        <w:rPr>
+          <w:rFonts w:ascii="Arial" w:hAnsi="Arial" w:cs="Arial" w:eastAsia="Arial"/>
+          <w:b w:val="0"/>
+          <w:color w:val="000000"/>
+          <w:sz w:val="36"/>
+        </w:rPr>
+      </w:r>
+    </w:p>
+    <w:p>
+      <w:pPr>
+        <w:spacing w:lineRule="auto" w:line="276" w:before="0" w:after="0"/>
+      </w:pPr>
+      <w:r>
+        <w:rPr>
+          <w:rFonts w:ascii="Arial" w:hAnsi="Arial" w:cs="Arial" w:eastAsia="Arial"/>
+          <w:b/>
+          <w:color w:val="FF0000"/>
+          <w:sz w:val="36"/>
+        </w:rPr>
         <w:t>(((LON EXITS)))</w:t>
       </w:r>
     </w:p>
@@ -3021,7 +3208,7 @@
           <w:color w:val="000000"/>
           <w:sz w:val="36"/>
         </w:rPr>
-        <w:t xml:space="preserve">-SO REMEMBER: IT'S ON UNTIL </w:t>
+        <w:t xml:space="preserve">-SO HERE'S WHAT TO REMEMBER: IT'S ON UNTIL </w:t>
       </w:r>
       <w:r>
         <w:rPr>
@@ -3120,27 +3307,27 @@
           <w:color w:val="000000"/>
           <w:sz w:val="36"/>
         </w:rPr>
-        <w:t>-NUMBER TWO. TURN OFF THE VIEWING DATA. YOUR TV KEEPS WORKING.</w:t>
-      </w:r>
-    </w:p>
-    <w:p>
-      <w:pPr>
-        <w:spacing w:lineRule="auto" w:line="276" w:before="0" w:after="0"/>
-      </w:pPr>
-      <w:r>
-        <w:rPr>
-          <w:rFonts w:ascii="Arial" w:hAnsi="Arial" w:cs="Arial" w:eastAsia="Arial"/>
-          <w:b w:val="0"/>
-          <w:color w:val="000000"/>
-          <w:sz w:val="36"/>
-        </w:rPr>
-      </w:r>
-    </w:p>
-    <w:p>
-      <w:pPr>
-        <w:spacing w:lineRule="auto" w:line="276" w:before="0" w:after="0"/>
-      </w:pPr>
-      <w:commentRangeStart w:id="4"/>
+        <w:t>-NUMBER TWO. TURN OFF THE VIEWING DATA. JUST THAT SETTING.</w:t>
+      </w:r>
+    </w:p>
+    <w:p>
+      <w:pPr>
+        <w:spacing w:lineRule="auto" w:line="276" w:before="0" w:after="0"/>
+      </w:pPr>
+      <w:r>
+        <w:rPr>
+          <w:rFonts w:ascii="Arial" w:hAnsi="Arial" w:cs="Arial" w:eastAsia="Arial"/>
+          <w:b w:val="0"/>
+          <w:color w:val="000000"/>
+          <w:sz w:val="36"/>
+        </w:rPr>
+      </w:r>
+    </w:p>
+    <w:p>
+      <w:pPr>
+        <w:spacing w:lineRule="auto" w:line="276" w:before="0" w:after="0"/>
+      </w:pPr>
+      <w:commentRangeStart w:id="6"/>
       <w:r>
         <w:rPr>
           <w:rFonts w:ascii="Arial" w:hAnsi="Arial" w:cs="Arial" w:eastAsia="Arial"/>
@@ -3150,12 +3337,12 @@
         </w:rPr>
         <w:t>-NUMBER THREE. DON'T USE VOICE CONTROL? TURN THE MICROPHONE OFF TOO.</w:t>
       </w:r>
-      <w:commentRangeEnd w:id="4"/>
+      <w:commentRangeEnd w:id="6"/>
       <w:r>
         <w:rPr>
           <w:rStyle w:val="CommentReference"/>
         </w:rPr>
-        <w:commentReference w:id="4"/>
+        <w:commentReference w:id="6"/>
       </w:r>
     </w:p>
     <w:p>
@@ -3759,7 +3946,7 @@
       <w:pPr>
         <w:spacing w:lineRule="auto" w:line="276" w:before="0" w:after="0"/>
       </w:pPr>
-      <w:commentRangeStart w:id="5"/>
+      <w:commentRangeStart w:id="7"/>
       <w:r>
         <w:rPr>
           <w:rFonts w:ascii="Arial" w:hAnsi="Arial" w:cs="Arial" w:eastAsia="Arial"/>
@@ -3787,12 +3974,12 @@
         </w:rPr>
         <w:t xml:space="preserve"> FOR TWO DENTS HE NEVER EVEN NOTICED… AND IT ONLY WENT AWAY WHEN REPORTERS CALLED.</w:t>
       </w:r>
-      <w:commentRangeEnd w:id="5"/>
+      <w:commentRangeEnd w:id="7"/>
       <w:r>
         <w:rPr>
           <w:rStyle w:val="CommentReference"/>
         </w:rPr>
-        <w:commentReference w:id="5"/>
+        <w:commentReference w:id="7"/>
       </w:r>
     </w:p>
     <w:p>
@@ -3876,7 +4063,7 @@
       <w:pPr>
         <w:spacing w:lineRule="auto" w:line="276" w:before="0" w:after="0"/>
       </w:pPr>
-      <w:commentRangeStart w:id="6"/>
+      <w:commentRangeStart w:id="8"/>
       <w:r>
         <w:rPr>
           <w:rFonts w:ascii="Arial" w:hAnsi="Arial" w:cs="Arial" w:eastAsia="Arial"/>
@@ -3904,12 +4091,12 @@
         </w:rPr>
         <w:t>.</w:t>
       </w:r>
-      <w:commentRangeEnd w:id="6"/>
+      <w:commentRangeEnd w:id="8"/>
       <w:r>
         <w:rPr>
           <w:rStyle w:val="CommentReference"/>
         </w:rPr>
-        <w:commentReference w:id="6"/>
+        <w:commentReference w:id="8"/>
       </w:r>
     </w:p>
     <w:p>
@@ -4287,7 +4474,7 @@
       <w:pPr>
         <w:spacing w:lineRule="auto" w:line="276" w:before="0" w:after="0"/>
       </w:pPr>
-      <w:commentRangeStart w:id="7"/>
+      <w:commentRangeStart w:id="9"/>
       <w:r>
         <w:rPr>
           <w:rFonts w:ascii="Arial" w:hAnsi="Arial" w:cs="Arial" w:eastAsia="Arial"/>
@@ -4297,12 +4484,12 @@
         </w:rPr>
         <w:t>-HE BRAGGED ABOUT HOW MANY TIRE CLAIMS HE'D FILED.</w:t>
       </w:r>
-      <w:commentRangeEnd w:id="7"/>
+      <w:commentRangeEnd w:id="9"/>
       <w:r>
         <w:rPr>
           <w:rStyle w:val="CommentReference"/>
         </w:rPr>
-        <w:commentReference w:id="7"/>
+        <w:commentReference w:id="9"/>
       </w:r>
     </w:p>
     <w:p>
@@ -5095,7 +5282,7 @@
       <w:pPr>
         <w:spacing w:lineRule="auto" w:line="276" w:before="0" w:after="0"/>
       </w:pPr>
-      <w:commentRangeStart w:id="8"/>
+      <w:commentRangeStart w:id="10"/>
       <w:r>
         <w:rPr>
           <w:rFonts w:ascii="Arial" w:hAnsi="Arial" w:cs="Arial" w:eastAsia="Arial"/>
@@ -5114,12 +5301,12 @@
         </w:rPr>
         <w:t>"PRICE PROTECTION PROGRAM."</w:t>
       </w:r>
-      <w:commentRangeEnd w:id="8"/>
+      <w:commentRangeEnd w:id="10"/>
       <w:r>
         <w:rPr>
           <w:rStyle w:val="CommentReference"/>
         </w:rPr>
-        <w:commentReference w:id="8"/>
+        <w:commentReference w:id="10"/>
       </w:r>
     </w:p>
     <w:p>
@@ -5506,7 +5693,7 @@
       <w:pPr>
         <w:spacing w:lineRule="auto" w:line="276" w:before="0" w:after="0"/>
       </w:pPr>
-      <w:commentRangeStart w:id="9"/>
+      <w:commentRangeStart w:id="11"/>
       <w:r>
         <w:rPr>
           <w:rFonts w:ascii="Arial" w:hAnsi="Arial" w:cs="Arial" w:eastAsia="Arial"/>
@@ -5516,12 +5703,12 @@
         </w:rPr>
         <w:t>-SHE SAYS THAT'S NOT HER SIGNATURE. THE COMPANY BLAMED A DOOR-TO-DOOR AGENT.</w:t>
       </w:r>
-      <w:commentRangeEnd w:id="9"/>
+      <w:commentRangeEnd w:id="11"/>
       <w:r>
         <w:rPr>
           <w:rStyle w:val="CommentReference"/>
         </w:rPr>
-        <w:commentReference w:id="9"/>
+        <w:commentReference w:id="11"/>
       </w:r>
     </w:p>
     <w:p>
@@ -6112,7 +6299,7 @@
 
 <file path=word/comments.xml><?xml version="1.0" encoding="utf-8"?>
 <w:comments xmlns:a="http://schemas.openxmlformats.org/drawingml/2006/main" xmlns:pic="http://schemas.openxmlformats.org/drawingml/2006/picture" xmlns:r="http://schemas.openxmlformats.org/officeDocument/2006/relationships" xmlns:w="http://schemas.openxmlformats.org/wordprocessingml/2006/main" xmlns:wp="http://schemas.openxmlformats.org/drawingml/2006/wordprocessingDrawing" xmlns:mc="http://schemas.openxmlformats.org/markup-compatibility/2006" xmlns:a14="http://schemas.microsoft.com/office/drawing/2010/main" xmlns:w14="http://schemas.microsoft.com/office/word/2010/wordml" xmlns:wpc="http://schemas.microsoft.com/office/word/2010/wordprocessingCanvas">
-  <w:comment w:id="0" w:author="Claude" w:initials="C" w:date="2026-10-14T00:50:02Z">
+  <w:comment w:id="0" w:author="Claude" w:initials="C" w:date="2026-10-14T01:20:32Z">
     <w:p>
       <w:pPr>
         <w:pStyle w:val="CommentText"/>
@@ -6124,11 +6311,11 @@
         <w:annotationRef/>
       </w:r>
       <w:r>
-        <w:t>JEFF PLEASE NOTE: The every-15-seconds figure is one 2024 study of LG sets, not every brand. Don't apply it to all TVs.</w:t>
+        <w:t>JEFF PLEASE NOTE: Vizio says some "activity data" is still collected even with viewing data off, unless you turn it off at setup or reset the TV.</w:t>
       </w:r>
     </w:p>
   </w:comment>
-  <w:comment w:id="1" w:author="Claude" w:initials="C" w:date="2026-10-14T00:50:02Z">
+  <w:comment w:id="1" w:author="Claude" w:initials="C" w:date="2026-10-14T01:20:32Z">
     <w:p>
       <w:pPr>
         <w:pStyle w:val="CommentText"/>
@@ -6140,11 +6327,11 @@
         <w:annotationRef/>
       </w:r>
       <w:r>
-        <w:t>JEFF PLEASE NOTE: Vizio says some "activity data" is still collected even with viewing data off, unless you turn it off at setup or reset the TV.</w:t>
+        <w:t>JEFF PLEASE NOTE: The deals cover Texans only. LG admits no wrongdoing. The clip includes a line about data transfers to the Chinese Communist Party.</w:t>
       </w:r>
     </w:p>
   </w:comment>
-  <w:comment w:id="2" w:author="Claude" w:initials="C" w:date="2026-10-14T00:50:02Z">
+  <w:comment w:id="2" w:author="Claude" w:initials="C" w:date="2026-10-14T01:20:32Z">
     <w:p>
       <w:pPr>
         <w:pStyle w:val="CommentText"/>
@@ -6156,11 +6343,11 @@
         <w:annotationRef/>
       </w:r>
       <w:r>
-        <w:t>JEFF PLEASE NOTE: The deals cover Texans only. LG admits no wrongdoing. The clip includes a line about data transfers to the Chinese Communist Party.</w:t>
+        <w:t>JEFF PLEASE NOTE: In their demo the recording was pulled out "by someone with remote access" through security holes. It does not show LG collecting audio. Never say "LG is listening"; say "the researchers say."</w:t>
       </w:r>
     </w:p>
   </w:comment>
-  <w:comment w:id="3" w:author="Claude" w:initials="C" w:date="2026-10-14T00:50:02Z">
+  <w:comment w:id="3" w:author="Claude" w:initials="C" w:date="2026-10-14T01:20:32Z">
     <w:p>
       <w:pPr>
         <w:pStyle w:val="CommentText"/>
@@ -6172,11 +6359,11 @@
         <w:annotationRef/>
       </w:r>
       <w:r>
-        <w:t>JEFF PLEASE NOTE: In their demo the recording was pulled out "by someone with remote access" through security holes. It does not show LG collecting audio. Never say "LG is listening"; say "the researchers say."</w:t>
+        <w:t>JEFF PLEASE NOTE: The every-15-seconds figure is one 2024 study of LG sets, not every brand.</w:t>
       </w:r>
     </w:p>
   </w:comment>
-  <w:comment w:id="4" w:author="Claude" w:initials="C" w:date="2026-10-14T00:50:02Z">
+  <w:comment w:id="4" w:author="Claude" w:initials="C" w:date="2026-10-14T01:20:32Z">
     <w:p>
       <w:pPr>
         <w:pStyle w:val="CommentText"/>
@@ -6188,11 +6375,43 @@
         <w:annotationRef/>
       </w:r>
       <w:r>
+        <w:t>JEFF PLEASE NOTE: This is Lon's own reading of the settlement, from his Lon.TV video. The AG's office calls it a major agreement for Texans' privacy, so treat this as his view.</w:t>
+      </w:r>
+    </w:p>
+  </w:comment>
+  <w:comment w:id="5" w:author="Claude" w:initials="C" w:date="2026-10-14T01:20:32Z">
+    <w:p>
+      <w:pPr>
+        <w:pStyle w:val="CommentText"/>
+      </w:pPr>
+      <w:r>
+        <w:rPr>
+          <w:rStyle w:val="CommentReference"/>
+        </w:rPr>
+        <w:annotationRef/>
+      </w:r>
+      <w:r>
+        <w:t>JEFF PLEASE NOTE: Lon says declining LG's full agreement blocks apps like YouTube on his set. Turning off the viewing-data setting alone is the move.</w:t>
+      </w:r>
+    </w:p>
+  </w:comment>
+  <w:comment w:id="6" w:author="Claude" w:initials="C" w:date="2026-10-14T01:20:32Z">
+    <w:p>
+      <w:pPr>
+        <w:pStyle w:val="CommentText"/>
+      </w:pPr>
+      <w:r>
+        <w:rPr>
+          <w:rStyle w:val="CommentReference"/>
+        </w:rPr>
+        <w:annotationRef/>
+      </w:r>
+      <w:r>
         <w:t>JEFF PLEASE NOTE: Fire TV is left off the brand list (an Amazon device). Add it only if the room asks.</w:t>
       </w:r>
     </w:p>
   </w:comment>
-  <w:comment w:id="5" w:author="Claude" w:initials="C" w:date="2026-10-14T00:50:02Z">
+  <w:comment w:id="7" w:author="Claude" w:initials="C" w:date="2026-10-14T01:20:32Z">
     <w:p>
       <w:pPr>
         <w:pStyle w:val="CommentText"/>
@@ -6208,7 +6427,7 @@
       </w:r>
     </w:p>
   </w:comment>
-  <w:comment w:id="6" w:author="Claude" w:initials="C" w:date="2026-10-14T00:50:02Z">
+  <w:comment w:id="8" w:author="Claude" w:initials="C" w:date="2026-10-14T01:20:32Z">
     <w:p>
       <w:pPr>
         <w:pStyle w:val="CommentText"/>
@@ -6224,7 +6443,7 @@
       </w:r>
     </w:p>
   </w:comment>
-  <w:comment w:id="7" w:author="Claude" w:initials="C" w:date="2026-10-14T00:50:02Z">
+  <w:comment w:id="9" w:author="Claude" w:initials="C" w:date="2026-10-14T01:20:32Z">
     <w:p>
       <w:pPr>
         <w:pStyle w:val="CommentText"/>
@@ -6240,7 +6459,7 @@
       </w:r>
     </w:p>
   </w:comment>
-  <w:comment w:id="8" w:author="Claude" w:initials="C" w:date="2026-10-14T00:50:02Z">
+  <w:comment w:id="10" w:author="Claude" w:initials="C" w:date="2026-10-14T01:20:32Z">
     <w:p>
       <w:pPr>
         <w:pStyle w:val="CommentText"/>
@@ -6256,7 +6475,7 @@
       </w:r>
     </w:p>
   </w:comment>
-  <w:comment w:id="9" w:author="Claude" w:initials="C" w:date="2026-10-14T00:50:02Z">
+  <w:comment w:id="11" w:author="Claude" w:initials="C" w:date="2026-10-14T01:20:32Z">
     <w:p>
       <w:pPr>
         <w:pStyle w:val="CommentText"/>

</xml_diff>